<commit_message>
Outside V8 Heap, buffer
</commit_message>
<xml_diff>
--- a/node-js/Buffer and Streams_Modules in Node js.docx
+++ b/node-js/Buffer and Streams_Modules in Node js.docx
@@ -115,7 +115,7 @@
     <w:p>
       <w:r>
         <w:pict w14:anchorId="35FCC1E0">
-          <v:rect id="_x0000_i1171" style="width:0;height:1.5pt" o:hralign="center" o:hrstd="t" o:hr="t" fillcolor="#a0a0a0" stroked="f"/>
+          <v:rect id="_x0000_i1025" style="width:0;height:1.5pt" o:hralign="center" o:hrstd="t" o:hr="t" fillcolor="#a0a0a0" stroked="f"/>
         </w:pict>
       </w:r>
     </w:p>
@@ -317,7 +317,7 @@
     <w:p>
       <w:r>
         <w:pict w14:anchorId="3CA67CC0">
-          <v:rect id="_x0000_i1172" style="width:0;height:1.5pt" o:hralign="center" o:hrstd="t" o:hr="t" fillcolor="#a0a0a0" stroked="f"/>
+          <v:rect id="_x0000_i1026" style="width:0;height:1.5pt" o:hralign="center" o:hrstd="t" o:hr="t" fillcolor="#a0a0a0" stroked="f"/>
         </w:pict>
       </w:r>
     </w:p>
@@ -904,7 +904,7 @@
     <w:p>
       <w:r>
         <w:pict w14:anchorId="5A0CAB70">
-          <v:rect id="_x0000_i1173" style="width:0;height:1.5pt" o:hralign="center" o:hrstd="t" o:hr="t" fillcolor="#a0a0a0" stroked="f"/>
+          <v:rect id="_x0000_i1027" style="width:0;height:1.5pt" o:hralign="center" o:hrstd="t" o:hr="t" fillcolor="#a0a0a0" stroked="f"/>
         </w:pict>
       </w:r>
     </w:p>
@@ -1433,7 +1433,7 @@
     <w:p>
       <w:r>
         <w:pict w14:anchorId="3319D1C9">
-          <v:rect id="_x0000_i1174" style="width:0;height:1.5pt" o:hralign="center" o:hrstd="t" o:hr="t" fillcolor="#a0a0a0" stroked="f"/>
+          <v:rect id="_x0000_i1028" style="width:0;height:1.5pt" o:hralign="center" o:hrstd="t" o:hr="t" fillcolor="#a0a0a0" stroked="f"/>
         </w:pict>
       </w:r>
     </w:p>
@@ -1577,7 +1577,7 @@
     <w:p>
       <w:r>
         <w:pict w14:anchorId="0091EDA8">
-          <v:rect id="_x0000_i1175" style="width:0;height:1.5pt" o:hralign="center" o:hrstd="t" o:hr="t" fillcolor="#a0a0a0" stroked="f"/>
+          <v:rect id="_x0000_i1029" style="width:0;height:1.5pt" o:hralign="center" o:hrstd="t" o:hr="t" fillcolor="#a0a0a0" stroked="f"/>
         </w:pict>
       </w:r>
     </w:p>
@@ -1701,6 +1701,9 @@
     </w:p>
     <w:p>
       <w:r>
+        <w:rPr>
+          <w:noProof/>
+        </w:rPr>
         <w:drawing>
           <wp:inline distT="0" distB="0" distL="0" distR="0" wp14:anchorId="7956ED24" wp14:editId="1CEF7500">
             <wp:extent cx="190500" cy="190500"/>
@@ -1751,6 +1754,9 @@
         </w:drawing>
       </w:r>
       <w:r>
+        <w:rPr>
+          <w:noProof/>
+        </w:rPr>
         <w:drawing>
           <wp:inline distT="0" distB="0" distL="0" distR="0" wp14:anchorId="16D4773E" wp14:editId="03D55BA1">
             <wp:extent cx="190500" cy="190500"/>
@@ -1801,6 +1807,9 @@
         </w:drawing>
       </w:r>
       <w:r>
+        <w:rPr>
+          <w:noProof/>
+        </w:rPr>
         <w:drawing>
           <wp:inline distT="0" distB="0" distL="0" distR="0" wp14:anchorId="6FEF3999" wp14:editId="151B1B12">
             <wp:extent cx="190500" cy="190500"/>
@@ -1892,6 +1901,9 @@
     </w:p>
     <w:p>
       <w:r>
+        <w:rPr>
+          <w:noProof/>
+        </w:rPr>
         <w:lastRenderedPageBreak/>
         <w:drawing>
           <wp:inline distT="0" distB="0" distL="0" distR="0" wp14:anchorId="478185A3" wp14:editId="1DFE7FFE">
@@ -1974,6 +1986,9 @@
     </w:p>
     <w:p>
       <w:r>
+        <w:rPr>
+          <w:noProof/>
+        </w:rPr>
         <w:drawing>
           <wp:inline distT="0" distB="0" distL="0" distR="0" wp14:anchorId="4EF09D26" wp14:editId="1B6AD6BC">
             <wp:extent cx="152400" cy="152400"/>
@@ -2047,6 +2062,9 @@
     </w:p>
     <w:p>
       <w:r>
+        <w:rPr>
+          <w:noProof/>
+        </w:rPr>
         <w:drawing>
           <wp:inline distT="0" distB="0" distL="0" distR="0" wp14:anchorId="7FC999F6" wp14:editId="5885E468">
             <wp:extent cx="1341120" cy="746760"/>
@@ -2104,6 +2122,9 @@
     </w:p>
     <w:p>
       <w:r>
+        <w:rPr>
+          <w:noProof/>
+        </w:rPr>
         <w:drawing>
           <wp:inline distT="0" distB="0" distL="0" distR="0" wp14:anchorId="7424666E" wp14:editId="54516956">
             <wp:extent cx="152400" cy="152400"/>
@@ -2235,7 +2256,7 @@
     <w:p>
       <w:r>
         <w:pict w14:anchorId="337A71BD">
-          <v:rect id="_x0000_i1183" style="width:0;height:1.5pt" o:hralign="center" o:hrstd="t" o:hr="t" fillcolor="#a0a0a0" stroked="f"/>
+          <v:rect id="_x0000_i1030" style="width:0;height:1.5pt" o:hralign="center" o:hrstd="t" o:hr="t" fillcolor="#a0a0a0" stroked="f"/>
         </w:pict>
       </w:r>
     </w:p>
@@ -2506,7 +2527,7 @@
     <w:p>
       <w:r>
         <w:pict w14:anchorId="7B6A2929">
-          <v:rect id="_x0000_i1184" style="width:0;height:1.5pt" o:hralign="center" o:hrstd="t" o:hr="t" fillcolor="#a0a0a0" stroked="f"/>
+          <v:rect id="_x0000_i1031" style="width:0;height:1.5pt" o:hralign="center" o:hrstd="t" o:hr="t" fillcolor="#a0a0a0" stroked="f"/>
         </w:pict>
       </w:r>
     </w:p>
@@ -2795,7 +2816,7 @@
     <w:p>
       <w:r>
         <w:pict w14:anchorId="32BA115E">
-          <v:rect id="_x0000_i1185" style="width:0;height:1.5pt" o:hralign="center" o:hrstd="t" o:hr="t" fillcolor="#a0a0a0" stroked="f"/>
+          <v:rect id="_x0000_i1032" style="width:0;height:1.5pt" o:hralign="center" o:hrstd="t" o:hr="t" fillcolor="#a0a0a0" stroked="f"/>
         </w:pict>
       </w:r>
     </w:p>
@@ -3173,7 +3194,7 @@
     <w:p>
       <w:r>
         <w:pict w14:anchorId="27390636">
-          <v:rect id="_x0000_i1186" style="width:0;height:1.5pt" o:hralign="center" o:hrstd="t" o:hr="t" fillcolor="#a0a0a0" stroked="f"/>
+          <v:rect id="_x0000_i1033" style="width:0;height:1.5pt" o:hralign="center" o:hrstd="t" o:hr="t" fillcolor="#a0a0a0" stroked="f"/>
         </w:pict>
       </w:r>
     </w:p>
@@ -3252,6 +3273,9 @@
     </w:p>
     <w:p>
       <w:r>
+        <w:rPr>
+          <w:noProof/>
+        </w:rPr>
         <w:drawing>
           <wp:inline distT="0" distB="0" distL="0" distR="0" wp14:anchorId="51B00EE5" wp14:editId="0C2D66F9">
             <wp:extent cx="457200" cy="457200"/>
@@ -3302,6 +3326,9 @@
         </w:drawing>
       </w:r>
       <w:r>
+        <w:rPr>
+          <w:noProof/>
+        </w:rPr>
         <w:drawing>
           <wp:inline distT="0" distB="0" distL="0" distR="0" wp14:anchorId="6A3859C1" wp14:editId="3B44711B">
             <wp:extent cx="1219200" cy="1219200"/>
@@ -3352,6 +3379,9 @@
         </w:drawing>
       </w:r>
       <w:r>
+        <w:rPr>
+          <w:noProof/>
+        </w:rPr>
         <w:drawing>
           <wp:inline distT="0" distB="0" distL="0" distR="0" wp14:anchorId="0ED836E7" wp14:editId="2DA1A61C">
             <wp:extent cx="1219200" cy="1219200"/>
@@ -3426,6 +3456,9 @@
     </w:p>
     <w:p>
       <w:r>
+        <w:rPr>
+          <w:noProof/>
+        </w:rPr>
         <w:drawing>
           <wp:inline distT="0" distB="0" distL="0" distR="0" wp14:anchorId="17BF0414" wp14:editId="171ABF08">
             <wp:extent cx="3512820" cy="1303020"/>
@@ -3478,6 +3511,9 @@
     </w:p>
     <w:p>
       <w:r>
+        <w:rPr>
+          <w:noProof/>
+        </w:rPr>
         <w:drawing>
           <wp:inline distT="0" distB="0" distL="0" distR="0" wp14:anchorId="160C23AC" wp14:editId="7FCDE84C">
             <wp:extent cx="457200" cy="457200"/>
@@ -3572,6 +3608,9 @@
     </w:p>
     <w:p>
       <w:r>
+        <w:rPr>
+          <w:noProof/>
+        </w:rPr>
         <w:drawing>
           <wp:inline distT="0" distB="0" distL="0" distR="0" wp14:anchorId="6AC13DFF" wp14:editId="0254F064">
             <wp:extent cx="3116580" cy="1470660"/>
@@ -3624,6 +3663,9 @@
     </w:p>
     <w:p>
       <w:r>
+        <w:rPr>
+          <w:noProof/>
+        </w:rPr>
         <w:drawing>
           <wp:inline distT="0" distB="0" distL="0" distR="0" wp14:anchorId="1274488A" wp14:editId="5D461BF7">
             <wp:extent cx="1219200" cy="1219200"/>
@@ -3707,6 +3749,9 @@
     </w:p>
     <w:p>
       <w:r>
+        <w:rPr>
+          <w:noProof/>
+        </w:rPr>
         <w:lastRenderedPageBreak/>
         <w:drawing>
           <wp:inline distT="0" distB="0" distL="0" distR="0" wp14:anchorId="120F9500" wp14:editId="277A093A">
@@ -3760,6 +3805,9 @@
     </w:p>
     <w:p>
       <w:r>
+        <w:rPr>
+          <w:noProof/>
+        </w:rPr>
         <w:drawing>
           <wp:inline distT="0" distB="0" distL="0" distR="0" wp14:anchorId="7AD3E3AF" wp14:editId="31FBEA8E">
             <wp:extent cx="1219200" cy="1219200"/>
@@ -4157,7 +4205,7 @@
     <w:p>
       <w:r>
         <w:pict w14:anchorId="2DD2A3BE">
-          <v:rect id="_x0000_i1196" style="width:0;height:1.5pt" o:hralign="center" o:hrstd="t" o:hr="t" fillcolor="#a0a0a0" stroked="f"/>
+          <v:rect id="_x0000_i1034" style="width:0;height:1.5pt" o:hralign="center" o:hrstd="t" o:hr="t" fillcolor="#a0a0a0" stroked="f"/>
         </w:pict>
       </w:r>
     </w:p>
@@ -4275,7 +4323,7 @@
     <w:p>
       <w:r>
         <w:pict w14:anchorId="04E06A8C">
-          <v:rect id="_x0000_i1197" style="width:0;height:1.5pt" o:hralign="center" o:hrstd="t" o:hr="t" fillcolor="#a0a0a0" stroked="f"/>
+          <v:rect id="_x0000_i1035" style="width:0;height:1.5pt" o:hralign="center" o:hrstd="t" o:hr="t" fillcolor="#a0a0a0" stroked="f"/>
         </w:pict>
       </w:r>
     </w:p>
@@ -4439,8 +4487,9 @@
           <w:sz w:val="28"/>
           <w:szCs w:val="28"/>
         </w:rPr>
-        <w:t xml:space="preserve">(buffer </w:t>
-      </w:r>
+        <w:t xml:space="preserve">(buffer The Core Module vs. Buffer </w:t>
+      </w:r>
+      <w:proofErr w:type="gramStart"/>
       <w:r>
         <w:rPr>
           <w:b/>
@@ -4449,8 +4498,9 @@
           <w:sz w:val="28"/>
           <w:szCs w:val="28"/>
         </w:rPr>
-        <w:t>The Core Module vs.</w:t>
-      </w:r>
+        <w:t>The</w:t>
+      </w:r>
+      <w:proofErr w:type="gramEnd"/>
       <w:r>
         <w:rPr>
           <w:b/>
@@ -4459,49 +4509,7 @@
           <w:sz w:val="28"/>
           <w:szCs w:val="28"/>
         </w:rPr>
-        <w:t xml:space="preserve"> Buffer</w:t>
-      </w:r>
-      <w:r>
-        <w:rPr>
-          <w:b/>
-          <w:bCs/>
-          <w:color w:val="FF0000"/>
-          <w:sz w:val="28"/>
-          <w:szCs w:val="28"/>
-        </w:rPr>
-        <w:t xml:space="preserve"> </w:t>
-      </w:r>
-      <w:proofErr w:type="gramStart"/>
-      <w:r>
-        <w:rPr>
-          <w:b/>
-          <w:bCs/>
-          <w:color w:val="FF0000"/>
-          <w:sz w:val="28"/>
-          <w:szCs w:val="28"/>
-        </w:rPr>
-        <w:t>The</w:t>
-      </w:r>
-      <w:proofErr w:type="gramEnd"/>
-      <w:r>
-        <w:rPr>
-          <w:b/>
-          <w:bCs/>
-          <w:color w:val="FF0000"/>
-          <w:sz w:val="28"/>
-          <w:szCs w:val="28"/>
-        </w:rPr>
-        <w:t xml:space="preserve"> Global Object</w:t>
-      </w:r>
-      <w:r>
-        <w:rPr>
-          <w:b/>
-          <w:bCs/>
-          <w:color w:val="FF0000"/>
-          <w:sz w:val="28"/>
-          <w:szCs w:val="28"/>
-        </w:rPr>
-        <w:t xml:space="preserve"> – google – ss)</w:t>
+        <w:t xml:space="preserve"> Global Object – google – ss)</w:t>
       </w:r>
     </w:p>
     <w:p>
@@ -5343,6 +5351,2207 @@
         <w:t>]</w:t>
       </w:r>
     </w:p>
+    <w:p>
+      <w:pPr>
+        <w:pBdr>
+          <w:bottom w:val="dotted" w:sz="24" w:space="1" w:color="auto"/>
+        </w:pBdr>
+      </w:pPr>
+    </w:p>
+    <w:p/>
+    <w:p>
+      <w:pPr>
+        <w:jc w:val="center"/>
+        <w:rPr>
+          <w:b/>
+          <w:bCs/>
+        </w:rPr>
+      </w:pPr>
+      <w:r>
+        <w:rPr>
+          <w:b/>
+          <w:bCs/>
+        </w:rPr>
+        <w:t>Outside V8 Heap means?</w:t>
+      </w:r>
+    </w:p>
+    <w:p>
+      <w:r>
+        <w:t xml:space="preserve">Being </w:t>
+      </w:r>
+      <w:r>
+        <w:rPr>
+          <w:b/>
+          <w:bCs/>
+        </w:rPr>
+        <w:t>"outside the V8 Heap"</w:t>
+      </w:r>
+      <w:r>
+        <w:t xml:space="preserve"> (or </w:t>
+      </w:r>
+      <w:proofErr w:type="gramStart"/>
+      <w:r>
+        <w:t>off-heap</w:t>
+      </w:r>
+      <w:proofErr w:type="gramEnd"/>
+      <w:r>
+        <w:t>) refers to memory used by your program (like Node.js or Chrome) that is managed directly by the computer's operating system or C++ rather than by the JavaScript engine. [</w:t>
+      </w:r>
+      <w:hyperlink r:id="rId122" w:history="1">
+        <w:r>
+          <w:rPr>
+            <w:rStyle w:val="Hyperlink"/>
+          </w:rPr>
+          <w:t>1</w:t>
+        </w:r>
+      </w:hyperlink>
+      <w:r>
+        <w:t xml:space="preserve">, </w:t>
+      </w:r>
+      <w:hyperlink r:id="rId123" w:history="1">
+        <w:r>
+          <w:rPr>
+            <w:rStyle w:val="Hyperlink"/>
+          </w:rPr>
+          <w:t>2</w:t>
+        </w:r>
+      </w:hyperlink>
+      <w:r>
+        <w:t xml:space="preserve">, </w:t>
+      </w:r>
+      <w:hyperlink r:id="rId124" w:history="1">
+        <w:r>
+          <w:rPr>
+            <w:rStyle w:val="Hyperlink"/>
+          </w:rPr>
+          <w:t>3</w:t>
+        </w:r>
+      </w:hyperlink>
+      <w:r>
+        <w:t xml:space="preserve">, </w:t>
+      </w:r>
+      <w:hyperlink r:id="rId125" w:history="1">
+        <w:r>
+          <w:rPr>
+            <w:rStyle w:val="Hyperlink"/>
+          </w:rPr>
+          <w:t>4</w:t>
+        </w:r>
+      </w:hyperlink>
+      <w:r>
+        <w:t xml:space="preserve">, </w:t>
+      </w:r>
+      <w:hyperlink r:id="rId126" w:history="1">
+        <w:r>
+          <w:rPr>
+            <w:rStyle w:val="Hyperlink"/>
+          </w:rPr>
+          <w:t>5</w:t>
+        </w:r>
+      </w:hyperlink>
+      <w:r>
+        <w:t>]</w:t>
+      </w:r>
+    </w:p>
+    <w:p>
+      <w:pPr>
+        <w:rPr>
+          <w:b/>
+          <w:bCs/>
+        </w:rPr>
+      </w:pPr>
+      <w:r>
+        <w:rPr>
+          <w:b/>
+          <w:bCs/>
+        </w:rPr>
+        <w:lastRenderedPageBreak/>
+        <w:t>The Two Worlds of Memory</w:t>
+      </w:r>
+    </w:p>
+    <w:p>
+      <w:r>
+        <w:t>Understanding where your memory lives is critical for debugging performance or "Out of Memory" crashes. [</w:t>
+      </w:r>
+      <w:hyperlink r:id="rId127" w:history="1">
+        <w:r>
+          <w:rPr>
+            <w:rStyle w:val="Hyperlink"/>
+          </w:rPr>
+          <w:t>1</w:t>
+        </w:r>
+      </w:hyperlink>
+      <w:r>
+        <w:t xml:space="preserve">, </w:t>
+      </w:r>
+      <w:hyperlink r:id="rId128" w:history="1">
+        <w:r>
+          <w:rPr>
+            <w:rStyle w:val="Hyperlink"/>
+          </w:rPr>
+          <w:t>2</w:t>
+        </w:r>
+      </w:hyperlink>
+      <w:r>
+        <w:t>]</w:t>
+      </w:r>
+    </w:p>
+    <w:tbl>
+      <w:tblPr>
+        <w:tblW w:w="0" w:type="auto"/>
+        <w:tblCellSpacing w:w="15" w:type="dxa"/>
+        <w:tblCellMar>
+          <w:top w:w="15" w:type="dxa"/>
+          <w:left w:w="15" w:type="dxa"/>
+          <w:bottom w:w="15" w:type="dxa"/>
+          <w:right w:w="15" w:type="dxa"/>
+        </w:tblCellMar>
+        <w:tblLook w:val="04A0" w:firstRow="1" w:lastRow="0" w:firstColumn="1" w:lastColumn="0" w:noHBand="0" w:noVBand="1"/>
+      </w:tblPr>
+      <w:tblGrid>
+        <w:gridCol w:w="1946"/>
+        <w:gridCol w:w="3362"/>
+        <w:gridCol w:w="2180"/>
+        <w:gridCol w:w="1872"/>
+      </w:tblGrid>
+      <w:tr>
+        <w:trPr>
+          <w:tblCellSpacing w:w="15" w:type="dxa"/>
+        </w:trPr>
+        <w:tc>
+          <w:tcPr>
+            <w:tcW w:w="0" w:type="auto"/>
+            <w:tcBorders>
+              <w:bottom w:val="single" w:sz="4" w:space="0" w:color="DCDFE5"/>
+            </w:tcBorders>
+            <w:vAlign w:val="center"/>
+            <w:hideMark/>
+          </w:tcPr>
+          <w:p>
+            <w:pPr>
+              <w:rPr>
+                <w:b/>
+                <w:bCs/>
+              </w:rPr>
+            </w:pPr>
+            <w:r>
+              <w:rPr>
+                <w:b/>
+                <w:bCs/>
+              </w:rPr>
+              <w:t>Memory Type [</w:t>
+            </w:r>
+            <w:hyperlink r:id="rId129" w:history="1">
+              <w:r>
+                <w:rPr>
+                  <w:rStyle w:val="Hyperlink"/>
+                  <w:b/>
+                  <w:bCs/>
+                </w:rPr>
+                <w:t>1</w:t>
+              </w:r>
+            </w:hyperlink>
+            <w:r>
+              <w:rPr>
+                <w:b/>
+                <w:bCs/>
+              </w:rPr>
+              <w:t xml:space="preserve">, </w:t>
+            </w:r>
+            <w:hyperlink r:id="rId130" w:history="1">
+              <w:r>
+                <w:rPr>
+                  <w:rStyle w:val="Hyperlink"/>
+                  <w:b/>
+                  <w:bCs/>
+                </w:rPr>
+                <w:t>2</w:t>
+              </w:r>
+            </w:hyperlink>
+            <w:r>
+              <w:rPr>
+                <w:b/>
+                <w:bCs/>
+              </w:rPr>
+              <w:t xml:space="preserve">, </w:t>
+            </w:r>
+            <w:hyperlink r:id="rId131" w:history="1">
+              <w:r>
+                <w:rPr>
+                  <w:rStyle w:val="Hyperlink"/>
+                  <w:b/>
+                  <w:bCs/>
+                </w:rPr>
+                <w:t>3</w:t>
+              </w:r>
+            </w:hyperlink>
+            <w:r>
+              <w:rPr>
+                <w:b/>
+                <w:bCs/>
+              </w:rPr>
+              <w:t xml:space="preserve">, </w:t>
+            </w:r>
+            <w:hyperlink r:id="rId132" w:history="1">
+              <w:r>
+                <w:rPr>
+                  <w:rStyle w:val="Hyperlink"/>
+                  <w:b/>
+                  <w:bCs/>
+                </w:rPr>
+                <w:t>4</w:t>
+              </w:r>
+            </w:hyperlink>
+            <w:r>
+              <w:rPr>
+                <w:b/>
+                <w:bCs/>
+              </w:rPr>
+              <w:t xml:space="preserve">, </w:t>
+            </w:r>
+            <w:hyperlink r:id="rId133" w:history="1">
+              <w:r>
+                <w:rPr>
+                  <w:rStyle w:val="Hyperlink"/>
+                  <w:b/>
+                  <w:bCs/>
+                </w:rPr>
+                <w:t>5</w:t>
+              </w:r>
+            </w:hyperlink>
+            <w:r>
+              <w:rPr>
+                <w:b/>
+                <w:bCs/>
+              </w:rPr>
+              <w:t xml:space="preserve">, </w:t>
+            </w:r>
+            <w:hyperlink r:id="rId134" w:history="1">
+              <w:r>
+                <w:rPr>
+                  <w:rStyle w:val="Hyperlink"/>
+                  <w:b/>
+                  <w:bCs/>
+                </w:rPr>
+                <w:t>6</w:t>
+              </w:r>
+            </w:hyperlink>
+            <w:r>
+              <w:rPr>
+                <w:b/>
+                <w:bCs/>
+              </w:rPr>
+              <w:t xml:space="preserve">, </w:t>
+            </w:r>
+            <w:hyperlink r:id="rId135" w:history="1">
+              <w:r>
+                <w:rPr>
+                  <w:rStyle w:val="Hyperlink"/>
+                  <w:b/>
+                  <w:bCs/>
+                </w:rPr>
+                <w:t>7</w:t>
+              </w:r>
+            </w:hyperlink>
+            <w:r>
+              <w:rPr>
+                <w:b/>
+                <w:bCs/>
+              </w:rPr>
+              <w:t xml:space="preserve">, </w:t>
+            </w:r>
+            <w:hyperlink r:id="rId136" w:history="1">
+              <w:r>
+                <w:rPr>
+                  <w:rStyle w:val="Hyperlink"/>
+                  <w:b/>
+                  <w:bCs/>
+                </w:rPr>
+                <w:t>8</w:t>
+              </w:r>
+            </w:hyperlink>
+            <w:r>
+              <w:rPr>
+                <w:b/>
+                <w:bCs/>
+              </w:rPr>
+              <w:t xml:space="preserve">, </w:t>
+            </w:r>
+            <w:hyperlink r:id="rId137" w:history="1">
+              <w:r>
+                <w:rPr>
+                  <w:rStyle w:val="Hyperlink"/>
+                  <w:b/>
+                  <w:bCs/>
+                </w:rPr>
+                <w:t>9</w:t>
+              </w:r>
+            </w:hyperlink>
+            <w:r>
+              <w:rPr>
+                <w:b/>
+                <w:bCs/>
+              </w:rPr>
+              <w:t xml:space="preserve">, </w:t>
+            </w:r>
+            <w:hyperlink r:id="rId138" w:history="1">
+              <w:r>
+                <w:rPr>
+                  <w:rStyle w:val="Hyperlink"/>
+                  <w:b/>
+                  <w:bCs/>
+                </w:rPr>
+                <w:t>10</w:t>
+              </w:r>
+            </w:hyperlink>
+            <w:r>
+              <w:rPr>
+                <w:b/>
+                <w:bCs/>
+              </w:rPr>
+              <w:t xml:space="preserve">, </w:t>
+            </w:r>
+            <w:hyperlink r:id="rId139" w:history="1">
+              <w:r>
+                <w:rPr>
+                  <w:rStyle w:val="Hyperlink"/>
+                  <w:b/>
+                  <w:bCs/>
+                </w:rPr>
+                <w:t>11</w:t>
+              </w:r>
+            </w:hyperlink>
+            <w:r>
+              <w:rPr>
+                <w:b/>
+                <w:bCs/>
+              </w:rPr>
+              <w:t>]</w:t>
+            </w:r>
+          </w:p>
+        </w:tc>
+        <w:tc>
+          <w:tcPr>
+            <w:tcW w:w="0" w:type="auto"/>
+            <w:tcBorders>
+              <w:bottom w:val="single" w:sz="4" w:space="0" w:color="DCDFE5"/>
+            </w:tcBorders>
+            <w:vAlign w:val="center"/>
+            <w:hideMark/>
+          </w:tcPr>
+          <w:p>
+            <w:pPr>
+              <w:rPr>
+                <w:b/>
+                <w:bCs/>
+              </w:rPr>
+            </w:pPr>
+            <w:r>
+              <w:rPr>
+                <w:b/>
+                <w:bCs/>
+              </w:rPr>
+              <w:t>What It Is</w:t>
+            </w:r>
+          </w:p>
+        </w:tc>
+        <w:tc>
+          <w:tcPr>
+            <w:tcW w:w="0" w:type="auto"/>
+            <w:tcBorders>
+              <w:bottom w:val="single" w:sz="4" w:space="0" w:color="DCDFE5"/>
+            </w:tcBorders>
+            <w:vAlign w:val="center"/>
+            <w:hideMark/>
+          </w:tcPr>
+          <w:p>
+            <w:pPr>
+              <w:rPr>
+                <w:b/>
+                <w:bCs/>
+              </w:rPr>
+            </w:pPr>
+            <w:r>
+              <w:rPr>
+                <w:b/>
+                <w:bCs/>
+              </w:rPr>
+              <w:t>Who Manages It</w:t>
+            </w:r>
+          </w:p>
+        </w:tc>
+        <w:tc>
+          <w:tcPr>
+            <w:tcW w:w="0" w:type="auto"/>
+            <w:tcBorders>
+              <w:bottom w:val="single" w:sz="4" w:space="0" w:color="DCDFE5"/>
+            </w:tcBorders>
+            <w:vAlign w:val="center"/>
+            <w:hideMark/>
+          </w:tcPr>
+          <w:p>
+            <w:pPr>
+              <w:rPr>
+                <w:b/>
+                <w:bCs/>
+              </w:rPr>
+            </w:pPr>
+            <w:r>
+              <w:rPr>
+                <w:b/>
+                <w:bCs/>
+              </w:rPr>
+              <w:t>Example Use Cases</w:t>
+            </w:r>
+          </w:p>
+        </w:tc>
+      </w:tr>
+      <w:tr>
+        <w:trPr>
+          <w:tblCellSpacing w:w="15" w:type="dxa"/>
+        </w:trPr>
+        <w:tc>
+          <w:tcPr>
+            <w:tcW w:w="0" w:type="auto"/>
+            <w:tcBorders>
+              <w:bottom w:val="single" w:sz="4" w:space="0" w:color="DCDFE5"/>
+            </w:tcBorders>
+            <w:vAlign w:val="center"/>
+            <w:hideMark/>
+          </w:tcPr>
+          <w:p>
+            <w:r>
+              <w:rPr>
+                <w:b/>
+                <w:bCs/>
+              </w:rPr>
+              <w:t>Inside V8 Heap</w:t>
+            </w:r>
+          </w:p>
+        </w:tc>
+        <w:tc>
+          <w:tcPr>
+            <w:tcW w:w="0" w:type="auto"/>
+            <w:tcBorders>
+              <w:bottom w:val="single" w:sz="4" w:space="0" w:color="DCDFE5"/>
+            </w:tcBorders>
+            <w:vAlign w:val="center"/>
+            <w:hideMark/>
+          </w:tcPr>
+          <w:p>
+            <w:r>
+              <w:t>Dynamic memory for JavaScript objects, closures, and strings.</w:t>
+            </w:r>
+          </w:p>
+        </w:tc>
+        <w:tc>
+          <w:tcPr>
+            <w:tcW w:w="0" w:type="auto"/>
+            <w:tcBorders>
+              <w:bottom w:val="single" w:sz="4" w:space="0" w:color="DCDFE5"/>
+            </w:tcBorders>
+            <w:vAlign w:val="center"/>
+            <w:hideMark/>
+          </w:tcPr>
+          <w:p>
+            <w:r>
+              <w:t xml:space="preserve">The V8 engine's </w:t>
+            </w:r>
+            <w:r>
+              <w:rPr>
+                <w:b/>
+                <w:bCs/>
+              </w:rPr>
+              <w:t>Garbage Collector</w:t>
+            </w:r>
+            <w:r>
+              <w:t>.</w:t>
+            </w:r>
+          </w:p>
+        </w:tc>
+        <w:tc>
+          <w:tcPr>
+            <w:tcW w:w="0" w:type="auto"/>
+            <w:tcBorders>
+              <w:bottom w:val="single" w:sz="4" w:space="0" w:color="DCDFE5"/>
+            </w:tcBorders>
+            <w:vAlign w:val="center"/>
+            <w:hideMark/>
+          </w:tcPr>
+          <w:p>
+            <w:r>
+              <w:t xml:space="preserve">const obj = </w:t>
+            </w:r>
+            <w:proofErr w:type="gramStart"/>
+            <w:r>
+              <w:t>{ a</w:t>
+            </w:r>
+            <w:proofErr w:type="gramEnd"/>
+            <w:r>
+              <w:t xml:space="preserve">: </w:t>
+            </w:r>
+            <w:proofErr w:type="gramStart"/>
+            <w:r>
+              <w:t>1 }</w:t>
+            </w:r>
+            <w:proofErr w:type="gramEnd"/>
+          </w:p>
+        </w:tc>
+      </w:tr>
+      <w:tr>
+        <w:trPr>
+          <w:tblCellSpacing w:w="15" w:type="dxa"/>
+        </w:trPr>
+        <w:tc>
+          <w:tcPr>
+            <w:tcW w:w="0" w:type="auto"/>
+            <w:tcBorders>
+              <w:bottom w:val="nil"/>
+            </w:tcBorders>
+            <w:vAlign w:val="center"/>
+            <w:hideMark/>
+          </w:tcPr>
+          <w:p>
+            <w:r>
+              <w:rPr>
+                <w:b/>
+                <w:bCs/>
+              </w:rPr>
+              <w:t>Outside V8 Heap</w:t>
+            </w:r>
+          </w:p>
+        </w:tc>
+        <w:tc>
+          <w:tcPr>
+            <w:tcW w:w="0" w:type="auto"/>
+            <w:tcBorders>
+              <w:bottom w:val="nil"/>
+            </w:tcBorders>
+            <w:vAlign w:val="center"/>
+            <w:hideMark/>
+          </w:tcPr>
+          <w:p>
+            <w:r>
+              <w:t xml:space="preserve">Memory allocated directly by the OS, underlying C++ addons, or </w:t>
+            </w:r>
+            <w:proofErr w:type="spellStart"/>
+            <w:r>
+              <w:t>WebAssembly</w:t>
+            </w:r>
+            <w:proofErr w:type="spellEnd"/>
+            <w:r>
+              <w:t>.</w:t>
+            </w:r>
+          </w:p>
+        </w:tc>
+        <w:tc>
+          <w:tcPr>
+            <w:tcW w:w="0" w:type="auto"/>
+            <w:tcBorders>
+              <w:bottom w:val="nil"/>
+            </w:tcBorders>
+            <w:vAlign w:val="center"/>
+            <w:hideMark/>
+          </w:tcPr>
+          <w:p>
+            <w:r>
+              <w:t>The program (e.g., C/C++ memory allocation).</w:t>
+            </w:r>
+          </w:p>
+        </w:tc>
+        <w:tc>
+          <w:tcPr>
+            <w:tcW w:w="0" w:type="auto"/>
+            <w:tcBorders>
+              <w:bottom w:val="nil"/>
+            </w:tcBorders>
+            <w:vAlign w:val="center"/>
+            <w:hideMark/>
+          </w:tcPr>
+          <w:p>
+            <w:r>
+              <w:t>Node.js Buffer, Streams, heavy file data.</w:t>
+            </w:r>
+          </w:p>
+        </w:tc>
+      </w:tr>
+    </w:tbl>
+    <w:p>
+      <w:pPr>
+        <w:rPr>
+          <w:b/>
+          <w:bCs/>
+        </w:rPr>
+      </w:pPr>
+      <w:r>
+        <w:rPr>
+          <w:b/>
+          <w:bCs/>
+        </w:rPr>
+        <w:t>Why Does This Matter?</w:t>
+      </w:r>
+    </w:p>
+    <w:p>
+      <w:pPr>
+        <w:numPr>
+          <w:ilvl w:val="0"/>
+          <w:numId w:val="15"/>
+        </w:numPr>
+      </w:pPr>
+      <w:r>
+        <w:rPr>
+          <w:b/>
+          <w:bCs/>
+        </w:rPr>
+        <w:t>Garbage Collection Limits:</w:t>
+      </w:r>
+      <w:r>
+        <w:t xml:space="preserve"> The V8 Engine does not scan, clean up, or monitor outside-heap memory. It only tracks the JavaScript objects tied to that memory. [</w:t>
+      </w:r>
+      <w:hyperlink r:id="rId140" w:history="1">
+        <w:r>
+          <w:rPr>
+            <w:rStyle w:val="Hyperlink"/>
+          </w:rPr>
+          <w:t>1</w:t>
+        </w:r>
+      </w:hyperlink>
+      <w:r>
+        <w:t xml:space="preserve">, </w:t>
+      </w:r>
+      <w:hyperlink r:id="rId141" w:history="1">
+        <w:r>
+          <w:rPr>
+            <w:rStyle w:val="Hyperlink"/>
+          </w:rPr>
+          <w:t>2</w:t>
+        </w:r>
+      </w:hyperlink>
+      <w:r>
+        <w:t xml:space="preserve">, </w:t>
+      </w:r>
+      <w:hyperlink r:id="rId142" w:history="1">
+        <w:r>
+          <w:rPr>
+            <w:rStyle w:val="Hyperlink"/>
+          </w:rPr>
+          <w:t>3</w:t>
+        </w:r>
+      </w:hyperlink>
+      <w:r>
+        <w:t>]</w:t>
+      </w:r>
+    </w:p>
+    <w:p>
+      <w:pPr>
+        <w:numPr>
+          <w:ilvl w:val="0"/>
+          <w:numId w:val="15"/>
+        </w:numPr>
+      </w:pPr>
+      <w:r>
+        <w:rPr>
+          <w:b/>
+          <w:bCs/>
+        </w:rPr>
+        <w:t>Hidden Crashes:</w:t>
+      </w:r>
+      <w:r>
+        <w:t xml:space="preserve"> Your JavaScript heap can look perfectly fine, but if your code creates massive Buffer objects (e.g., loading huge files entirely into memory), you can crash the system with an "Out of Memory" (OOM) error. [</w:t>
+      </w:r>
+      <w:hyperlink r:id="rId143" w:history="1">
+        <w:r>
+          <w:rPr>
+            <w:rStyle w:val="Hyperlink"/>
+          </w:rPr>
+          <w:t>1</w:t>
+        </w:r>
+      </w:hyperlink>
+      <w:r>
+        <w:t>]</w:t>
+      </w:r>
+    </w:p>
+    <w:p>
+      <w:pPr>
+        <w:numPr>
+          <w:ilvl w:val="0"/>
+          <w:numId w:val="15"/>
+        </w:numPr>
+      </w:pPr>
+      <w:r>
+        <w:rPr>
+          <w:b/>
+          <w:bCs/>
+        </w:rPr>
+        <w:t>Sandbox Security:</w:t>
+      </w:r>
+      <w:r>
+        <w:t xml:space="preserve"> Modern V8 versions (like in Chromium) isolate potentially unsafe or native memory outside of the V8 Heap to prevent exploits from breaking out of the JavaScript environment. [</w:t>
+      </w:r>
+      <w:hyperlink r:id="rId144" w:history="1">
+        <w:r>
+          <w:rPr>
+            <w:rStyle w:val="Hyperlink"/>
+          </w:rPr>
+          <w:t>1</w:t>
+        </w:r>
+      </w:hyperlink>
+      <w:r>
+        <w:t xml:space="preserve">, </w:t>
+      </w:r>
+      <w:hyperlink r:id="rId145" w:history="1">
+        <w:r>
+          <w:rPr>
+            <w:rStyle w:val="Hyperlink"/>
+          </w:rPr>
+          <w:t>2</w:t>
+        </w:r>
+      </w:hyperlink>
+      <w:r>
+        <w:t>]</w:t>
+      </w:r>
+    </w:p>
+    <w:p>
+      <w:r>
+        <w:t>If you are dealing with memory issues in a project, I can help you:</w:t>
+      </w:r>
+    </w:p>
+    <w:p>
+      <w:pPr>
+        <w:numPr>
+          <w:ilvl w:val="0"/>
+          <w:numId w:val="16"/>
+        </w:numPr>
+      </w:pPr>
+      <w:r>
+        <w:rPr>
+          <w:b/>
+          <w:bCs/>
+        </w:rPr>
+        <w:t>Identify if the leak is on or off the heap</w:t>
+      </w:r>
+    </w:p>
+    <w:p>
+      <w:pPr>
+        <w:numPr>
+          <w:ilvl w:val="0"/>
+          <w:numId w:val="16"/>
+        </w:numPr>
+      </w:pPr>
+      <w:r>
+        <w:rPr>
+          <w:b/>
+          <w:bCs/>
+        </w:rPr>
+        <w:t>Optimize large data processing</w:t>
+      </w:r>
+      <w:r>
+        <w:t xml:space="preserve"> (e.g., implementing streams)</w:t>
+      </w:r>
+    </w:p>
+    <w:p>
+      <w:pPr>
+        <w:numPr>
+          <w:ilvl w:val="0"/>
+          <w:numId w:val="16"/>
+        </w:numPr>
+      </w:pPr>
+      <w:r>
+        <w:rPr>
+          <w:b/>
+          <w:bCs/>
+        </w:rPr>
+        <w:t>Adjust V8 memory limits</w:t>
+      </w:r>
+      <w:r>
+        <w:t xml:space="preserve"> (e.g</w:t>
+      </w:r>
+      <w:proofErr w:type="gramStart"/>
+      <w:r>
+        <w:t>., -</w:t>
+      </w:r>
+      <w:proofErr w:type="gramEnd"/>
+      <w:r>
+        <w:t>-max-old-space-size)</w:t>
+      </w:r>
+    </w:p>
+    <w:p>
+      <w:r>
+        <w:t xml:space="preserve">Let me know what kind of </w:t>
+      </w:r>
+      <w:r>
+        <w:rPr>
+          <w:b/>
+          <w:bCs/>
+        </w:rPr>
+        <w:t>application or error</w:t>
+      </w:r>
+      <w:r>
+        <w:t xml:space="preserve"> you are troubleshooting!</w:t>
+      </w:r>
+    </w:p>
+    <w:p>
+      <w:r>
+        <w:drawing>
+          <wp:inline distT="0" distB="0" distL="0" distR="0" wp14:anchorId="7322C33B" wp14:editId="6AE60E6D">
+            <wp:extent cx="190500" cy="190500"/>
+            <wp:effectExtent l="0" t="0" r="0" b="0"/>
+            <wp:docPr id="377377735" name="Picture 18"/>
+            <wp:cNvGraphicFramePr>
+              <a:graphicFrameLocks xmlns:a="http://schemas.openxmlformats.org/drawingml/2006/main" noChangeAspect="1"/>
+            </wp:cNvGraphicFramePr>
+            <a:graphic xmlns:a="http://schemas.openxmlformats.org/drawingml/2006/main">
+              <a:graphicData uri="http://schemas.openxmlformats.org/drawingml/2006/picture">
+                <pic:pic xmlns:pic="http://schemas.openxmlformats.org/drawingml/2006/picture">
+                  <pic:nvPicPr>
+                    <pic:cNvPr id="0" name="Picture 69"/>
+                    <pic:cNvPicPr>
+                      <a:picLocks noChangeAspect="1" noChangeArrowheads="1"/>
+                    </pic:cNvPicPr>
+                  </pic:nvPicPr>
+                  <pic:blipFill>
+                    <a:blip r:embed="rId53">
+                      <a:extLst>
+                        <a:ext uri="{28A0092B-C50C-407E-A947-70E740481C1C}">
+                          <a14:useLocalDpi xmlns:a14="http://schemas.microsoft.com/office/drawing/2010/main" val="0"/>
+                        </a:ext>
+                      </a:extLst>
+                    </a:blip>
+                    <a:srcRect/>
+                    <a:stretch>
+                      <a:fillRect/>
+                    </a:stretch>
+                  </pic:blipFill>
+                  <pic:spPr bwMode="auto">
+                    <a:xfrm>
+                      <a:off x="0" y="0"/>
+                      <a:ext cx="190500" cy="190500"/>
+                    </a:xfrm>
+                    <a:prstGeom prst="rect">
+                      <a:avLst/>
+                    </a:prstGeom>
+                    <a:noFill/>
+                    <a:ln>
+                      <a:noFill/>
+                    </a:ln>
+                  </pic:spPr>
+                </pic:pic>
+              </a:graphicData>
+            </a:graphic>
+          </wp:inline>
+        </w:drawing>
+      </w:r>
+      <w:r>
+        <w:drawing>
+          <wp:inline distT="0" distB="0" distL="0" distR="0" wp14:anchorId="17A8AF03" wp14:editId="488B1588">
+            <wp:extent cx="190500" cy="190500"/>
+            <wp:effectExtent l="0" t="0" r="0" b="0"/>
+            <wp:docPr id="1163146359" name="Picture 17"/>
+            <wp:cNvGraphicFramePr>
+              <a:graphicFrameLocks xmlns:a="http://schemas.openxmlformats.org/drawingml/2006/main" noChangeAspect="1"/>
+            </wp:cNvGraphicFramePr>
+            <a:graphic xmlns:a="http://schemas.openxmlformats.org/drawingml/2006/main">
+              <a:graphicData uri="http://schemas.openxmlformats.org/drawingml/2006/picture">
+                <pic:pic xmlns:pic="http://schemas.openxmlformats.org/drawingml/2006/picture">
+                  <pic:nvPicPr>
+                    <pic:cNvPr id="0" name="Picture 70"/>
+                    <pic:cNvPicPr>
+                      <a:picLocks noChangeAspect="1" noChangeArrowheads="1"/>
+                    </pic:cNvPicPr>
+                  </pic:nvPicPr>
+                  <pic:blipFill>
+                    <a:blip r:embed="rId146">
+                      <a:extLst>
+                        <a:ext uri="{28A0092B-C50C-407E-A947-70E740481C1C}">
+                          <a14:useLocalDpi xmlns:a14="http://schemas.microsoft.com/office/drawing/2010/main" val="0"/>
+                        </a:ext>
+                      </a:extLst>
+                    </a:blip>
+                    <a:srcRect/>
+                    <a:stretch>
+                      <a:fillRect/>
+                    </a:stretch>
+                  </pic:blipFill>
+                  <pic:spPr bwMode="auto">
+                    <a:xfrm>
+                      <a:off x="0" y="0"/>
+                      <a:ext cx="190500" cy="190500"/>
+                    </a:xfrm>
+                    <a:prstGeom prst="rect">
+                      <a:avLst/>
+                    </a:prstGeom>
+                    <a:noFill/>
+                    <a:ln>
+                      <a:noFill/>
+                    </a:ln>
+                  </pic:spPr>
+                </pic:pic>
+              </a:graphicData>
+            </a:graphic>
+          </wp:inline>
+        </w:drawing>
+      </w:r>
+      <w:r>
+        <w:drawing>
+          <wp:inline distT="0" distB="0" distL="0" distR="0" wp14:anchorId="3D4ED43E" wp14:editId="69DBAB04">
+            <wp:extent cx="190500" cy="190500"/>
+            <wp:effectExtent l="0" t="0" r="0" b="0"/>
+            <wp:docPr id="1600537430" name="Picture 16"/>
+            <wp:cNvGraphicFramePr>
+              <a:graphicFrameLocks xmlns:a="http://schemas.openxmlformats.org/drawingml/2006/main" noChangeAspect="1"/>
+            </wp:cNvGraphicFramePr>
+            <a:graphic xmlns:a="http://schemas.openxmlformats.org/drawingml/2006/main">
+              <a:graphicData uri="http://schemas.openxmlformats.org/drawingml/2006/picture">
+                <pic:pic xmlns:pic="http://schemas.openxmlformats.org/drawingml/2006/picture">
+                  <pic:nvPicPr>
+                    <pic:cNvPr id="0" name="Picture 71"/>
+                    <pic:cNvPicPr>
+                      <a:picLocks noChangeAspect="1" noChangeArrowheads="1"/>
+                    </pic:cNvPicPr>
+                  </pic:nvPicPr>
+                  <pic:blipFill>
+                    <a:blip r:embed="rId147">
+                      <a:extLst>
+                        <a:ext uri="{28A0092B-C50C-407E-A947-70E740481C1C}">
+                          <a14:useLocalDpi xmlns:a14="http://schemas.microsoft.com/office/drawing/2010/main" val="0"/>
+                        </a:ext>
+                      </a:extLst>
+                    </a:blip>
+                    <a:srcRect/>
+                    <a:stretch>
+                      <a:fillRect/>
+                    </a:stretch>
+                  </pic:blipFill>
+                  <pic:spPr bwMode="auto">
+                    <a:xfrm>
+                      <a:off x="0" y="0"/>
+                      <a:ext cx="190500" cy="190500"/>
+                    </a:xfrm>
+                    <a:prstGeom prst="rect">
+                      <a:avLst/>
+                    </a:prstGeom>
+                    <a:noFill/>
+                    <a:ln>
+                      <a:noFill/>
+                    </a:ln>
+                  </pic:spPr>
+                </pic:pic>
+              </a:graphicData>
+            </a:graphic>
+          </wp:inline>
+        </w:drawing>
+      </w:r>
+    </w:p>
+    <w:p>
+      <w:r>
+        <w:t>14 sites</w:t>
+      </w:r>
+    </w:p>
+    <w:p>
+      <w:pPr>
+        <w:numPr>
+          <w:ilvl w:val="0"/>
+          <w:numId w:val="17"/>
+        </w:numPr>
+      </w:pPr>
+      <w:r>
+        <w:t>Understanding and Tuning Memory | Node.js Learn</w:t>
+      </w:r>
+    </w:p>
+    <w:p>
+      <w:r>
+        <w:lastRenderedPageBreak/>
+        <w:t>However, managing memory becomes a critical task as applications grow. Here's some information about memory usage in Node.js: * **</w:t>
+      </w:r>
+    </w:p>
+    <w:p>
+      <w:r>
+        <w:drawing>
+          <wp:inline distT="0" distB="0" distL="0" distR="0" wp14:anchorId="14311350" wp14:editId="225B9EFB">
+            <wp:extent cx="784860" cy="784860"/>
+            <wp:effectExtent l="0" t="0" r="0" b="0"/>
+            <wp:docPr id="1427010000" name="Picture 15"/>
+            <wp:cNvGraphicFramePr>
+              <a:graphicFrameLocks xmlns:a="http://schemas.openxmlformats.org/drawingml/2006/main" noChangeAspect="1"/>
+            </wp:cNvGraphicFramePr>
+            <a:graphic xmlns:a="http://schemas.openxmlformats.org/drawingml/2006/main">
+              <a:graphicData uri="http://schemas.openxmlformats.org/drawingml/2006/picture">
+                <pic:pic xmlns:pic="http://schemas.openxmlformats.org/drawingml/2006/picture">
+                  <pic:nvPicPr>
+                    <pic:cNvPr id="0" name="Picture 72"/>
+                    <pic:cNvPicPr>
+                      <a:picLocks noChangeAspect="1" noChangeArrowheads="1"/>
+                    </pic:cNvPicPr>
+                  </pic:nvPicPr>
+                  <pic:blipFill>
+                    <a:blip r:embed="rId148">
+                      <a:extLst>
+                        <a:ext uri="{28A0092B-C50C-407E-A947-70E740481C1C}">
+                          <a14:useLocalDpi xmlns:a14="http://schemas.microsoft.com/office/drawing/2010/main" val="0"/>
+                        </a:ext>
+                      </a:extLst>
+                    </a:blip>
+                    <a:srcRect/>
+                    <a:stretch>
+                      <a:fillRect/>
+                    </a:stretch>
+                  </pic:blipFill>
+                  <pic:spPr bwMode="auto">
+                    <a:xfrm>
+                      <a:off x="0" y="0"/>
+                      <a:ext cx="784860" cy="784860"/>
+                    </a:xfrm>
+                    <a:prstGeom prst="rect">
+                      <a:avLst/>
+                    </a:prstGeom>
+                    <a:noFill/>
+                    <a:ln>
+                      <a:noFill/>
+                    </a:ln>
+                  </pic:spPr>
+                </pic:pic>
+              </a:graphicData>
+            </a:graphic>
+          </wp:inline>
+        </w:drawing>
+      </w:r>
+    </w:p>
+    <w:p>
+      <w:r>
+        <w:drawing>
+          <wp:inline distT="0" distB="0" distL="0" distR="0" wp14:anchorId="39BE8DCC" wp14:editId="7BCD1A94">
+            <wp:extent cx="152400" cy="152400"/>
+            <wp:effectExtent l="0" t="0" r="0" b="0"/>
+            <wp:docPr id="176356642" name="Picture 14"/>
+            <wp:cNvGraphicFramePr>
+              <a:graphicFrameLocks xmlns:a="http://schemas.openxmlformats.org/drawingml/2006/main" noChangeAspect="1"/>
+            </wp:cNvGraphicFramePr>
+            <a:graphic xmlns:a="http://schemas.openxmlformats.org/drawingml/2006/main">
+              <a:graphicData uri="http://schemas.openxmlformats.org/drawingml/2006/picture">
+                <pic:pic xmlns:pic="http://schemas.openxmlformats.org/drawingml/2006/picture">
+                  <pic:nvPicPr>
+                    <pic:cNvPr id="0" name="Picture 73"/>
+                    <pic:cNvPicPr>
+                      <a:picLocks noChangeAspect="1" noChangeArrowheads="1"/>
+                    </pic:cNvPicPr>
+                  </pic:nvPicPr>
+                  <pic:blipFill>
+                    <a:blip r:embed="rId56">
+                      <a:extLst>
+                        <a:ext uri="{28A0092B-C50C-407E-A947-70E740481C1C}">
+                          <a14:useLocalDpi xmlns:a14="http://schemas.microsoft.com/office/drawing/2010/main" val="0"/>
+                        </a:ext>
+                      </a:extLst>
+                    </a:blip>
+                    <a:srcRect/>
+                    <a:stretch>
+                      <a:fillRect/>
+                    </a:stretch>
+                  </pic:blipFill>
+                  <pic:spPr bwMode="auto">
+                    <a:xfrm>
+                      <a:off x="0" y="0"/>
+                      <a:ext cx="152400" cy="152400"/>
+                    </a:xfrm>
+                    <a:prstGeom prst="rect">
+                      <a:avLst/>
+                    </a:prstGeom>
+                    <a:noFill/>
+                    <a:ln>
+                      <a:noFill/>
+                    </a:ln>
+                  </pic:spPr>
+                </pic:pic>
+              </a:graphicData>
+            </a:graphic>
+          </wp:inline>
+        </w:drawing>
+      </w:r>
+    </w:p>
+    <w:p>
+      <w:r>
+        <w:t>Node.js</w:t>
+      </w:r>
+    </w:p>
+    <w:p>
+      <w:pPr>
+        <w:numPr>
+          <w:ilvl w:val="0"/>
+          <w:numId w:val="17"/>
+        </w:numPr>
+      </w:pPr>
+      <w:r>
+        <w:t>Memory terminology | Chrome DevTools</w:t>
+      </w:r>
+    </w:p>
+    <w:p>
+      <w:r>
+        <w:t xml:space="preserve">the VM heap, or. externally in the renderer's memory. A wrapper object is created and used for accessing external storage </w:t>
+      </w:r>
+      <w:proofErr w:type="gramStart"/>
+      <w:r>
+        <w:t>where</w:t>
+      </w:r>
+      <w:proofErr w:type="gramEnd"/>
+      <w:r>
+        <w:t>, f...</w:t>
+      </w:r>
+    </w:p>
+    <w:p>
+      <w:r>
+        <w:drawing>
+          <wp:inline distT="0" distB="0" distL="0" distR="0" wp14:anchorId="5E52AB9E" wp14:editId="7AE9E4FA">
+            <wp:extent cx="784860" cy="784860"/>
+            <wp:effectExtent l="0" t="0" r="0" b="0"/>
+            <wp:docPr id="2044017842" name="Picture 13"/>
+            <wp:cNvGraphicFramePr>
+              <a:graphicFrameLocks xmlns:a="http://schemas.openxmlformats.org/drawingml/2006/main" noChangeAspect="1"/>
+            </wp:cNvGraphicFramePr>
+            <a:graphic xmlns:a="http://schemas.openxmlformats.org/drawingml/2006/main">
+              <a:graphicData uri="http://schemas.openxmlformats.org/drawingml/2006/picture">
+                <pic:pic xmlns:pic="http://schemas.openxmlformats.org/drawingml/2006/picture">
+                  <pic:nvPicPr>
+                    <pic:cNvPr id="0" name="Picture 74"/>
+                    <pic:cNvPicPr>
+                      <a:picLocks noChangeAspect="1" noChangeArrowheads="1"/>
+                    </pic:cNvPicPr>
+                  </pic:nvPicPr>
+                  <pic:blipFill>
+                    <a:blip r:embed="rId149">
+                      <a:extLst>
+                        <a:ext uri="{28A0092B-C50C-407E-A947-70E740481C1C}">
+                          <a14:useLocalDpi xmlns:a14="http://schemas.microsoft.com/office/drawing/2010/main" val="0"/>
+                        </a:ext>
+                      </a:extLst>
+                    </a:blip>
+                    <a:srcRect/>
+                    <a:stretch>
+                      <a:fillRect/>
+                    </a:stretch>
+                  </pic:blipFill>
+                  <pic:spPr bwMode="auto">
+                    <a:xfrm>
+                      <a:off x="0" y="0"/>
+                      <a:ext cx="784860" cy="784860"/>
+                    </a:xfrm>
+                    <a:prstGeom prst="rect">
+                      <a:avLst/>
+                    </a:prstGeom>
+                    <a:noFill/>
+                    <a:ln>
+                      <a:noFill/>
+                    </a:ln>
+                  </pic:spPr>
+                </pic:pic>
+              </a:graphicData>
+            </a:graphic>
+          </wp:inline>
+        </w:drawing>
+      </w:r>
+    </w:p>
+    <w:p>
+      <w:r>
+        <w:drawing>
+          <wp:inline distT="0" distB="0" distL="0" distR="0" wp14:anchorId="248EA471" wp14:editId="2BB6ACA9">
+            <wp:extent cx="152400" cy="152400"/>
+            <wp:effectExtent l="0" t="0" r="0" b="0"/>
+            <wp:docPr id="103942302" name="Picture 12"/>
+            <wp:cNvGraphicFramePr>
+              <a:graphicFrameLocks xmlns:a="http://schemas.openxmlformats.org/drawingml/2006/main" noChangeAspect="1"/>
+            </wp:cNvGraphicFramePr>
+            <a:graphic xmlns:a="http://schemas.openxmlformats.org/drawingml/2006/main">
+              <a:graphicData uri="http://schemas.openxmlformats.org/drawingml/2006/picture">
+                <pic:pic xmlns:pic="http://schemas.openxmlformats.org/drawingml/2006/picture">
+                  <pic:nvPicPr>
+                    <pic:cNvPr id="0" name="Picture 75"/>
+                    <pic:cNvPicPr>
+                      <a:picLocks noChangeAspect="1" noChangeArrowheads="1"/>
+                    </pic:cNvPicPr>
+                  </pic:nvPicPr>
+                  <pic:blipFill>
+                    <a:blip r:embed="rId150">
+                      <a:extLst>
+                        <a:ext uri="{28A0092B-C50C-407E-A947-70E740481C1C}">
+                          <a14:useLocalDpi xmlns:a14="http://schemas.microsoft.com/office/drawing/2010/main" val="0"/>
+                        </a:ext>
+                      </a:extLst>
+                    </a:blip>
+                    <a:srcRect/>
+                    <a:stretch>
+                      <a:fillRect/>
+                    </a:stretch>
+                  </pic:blipFill>
+                  <pic:spPr bwMode="auto">
+                    <a:xfrm>
+                      <a:off x="0" y="0"/>
+                      <a:ext cx="152400" cy="152400"/>
+                    </a:xfrm>
+                    <a:prstGeom prst="rect">
+                      <a:avLst/>
+                    </a:prstGeom>
+                    <a:noFill/>
+                    <a:ln>
+                      <a:noFill/>
+                    </a:ln>
+                  </pic:spPr>
+                </pic:pic>
+              </a:graphicData>
+            </a:graphic>
+          </wp:inline>
+        </w:drawing>
+      </w:r>
+    </w:p>
+    <w:p>
+      <w:r>
+        <w:t>Chrome for Developers</w:t>
+      </w:r>
+    </w:p>
+    <w:p>
+      <w:pPr>
+        <w:numPr>
+          <w:ilvl w:val="0"/>
+          <w:numId w:val="17"/>
+        </w:numPr>
+      </w:pPr>
+      <w:r>
+        <w:t xml:space="preserve">8 V8 memory myths (and what </w:t>
+      </w:r>
+      <w:proofErr w:type="gramStart"/>
+      <w:r>
+        <w:t>actually triggers</w:t>
+      </w:r>
+      <w:proofErr w:type="gramEnd"/>
+      <w:r>
+        <w:t xml:space="preserve"> the heap cliff) - Medium</w:t>
+      </w:r>
+    </w:p>
+    <w:p>
+      <w:r>
+        <w:t xml:space="preserve">Myth 8: “Buffers don't count; they're outside the heap” Buffers are outside the managed heap, but they absolutely count against </w:t>
+      </w:r>
+      <w:proofErr w:type="spellStart"/>
+      <w:r>
+        <w:t>yo</w:t>
+      </w:r>
+      <w:proofErr w:type="spellEnd"/>
+      <w:r>
+        <w:t>...</w:t>
+      </w:r>
+    </w:p>
+    <w:p>
+      <w:r>
+        <w:drawing>
+          <wp:inline distT="0" distB="0" distL="0" distR="0" wp14:anchorId="0F4746F0" wp14:editId="498A7CBC">
+            <wp:extent cx="784860" cy="784860"/>
+            <wp:effectExtent l="0" t="0" r="0" b="0"/>
+            <wp:docPr id="186249153" name="Picture 11"/>
+            <wp:cNvGraphicFramePr>
+              <a:graphicFrameLocks xmlns:a="http://schemas.openxmlformats.org/drawingml/2006/main" noChangeAspect="1"/>
+            </wp:cNvGraphicFramePr>
+            <a:graphic xmlns:a="http://schemas.openxmlformats.org/drawingml/2006/main">
+              <a:graphicData uri="http://schemas.openxmlformats.org/drawingml/2006/picture">
+                <pic:pic xmlns:pic="http://schemas.openxmlformats.org/drawingml/2006/picture">
+                  <pic:nvPicPr>
+                    <pic:cNvPr id="0" name="Picture 76"/>
+                    <pic:cNvPicPr>
+                      <a:picLocks noChangeAspect="1" noChangeArrowheads="1"/>
+                    </pic:cNvPicPr>
+                  </pic:nvPicPr>
+                  <pic:blipFill>
+                    <a:blip r:embed="rId151">
+                      <a:extLst>
+                        <a:ext uri="{28A0092B-C50C-407E-A947-70E740481C1C}">
+                          <a14:useLocalDpi xmlns:a14="http://schemas.microsoft.com/office/drawing/2010/main" val="0"/>
+                        </a:ext>
+                      </a:extLst>
+                    </a:blip>
+                    <a:srcRect/>
+                    <a:stretch>
+                      <a:fillRect/>
+                    </a:stretch>
+                  </pic:blipFill>
+                  <pic:spPr bwMode="auto">
+                    <a:xfrm>
+                      <a:off x="0" y="0"/>
+                      <a:ext cx="784860" cy="784860"/>
+                    </a:xfrm>
+                    <a:prstGeom prst="rect">
+                      <a:avLst/>
+                    </a:prstGeom>
+                    <a:noFill/>
+                    <a:ln>
+                      <a:noFill/>
+                    </a:ln>
+                  </pic:spPr>
+                </pic:pic>
+              </a:graphicData>
+            </a:graphic>
+          </wp:inline>
+        </w:drawing>
+      </w:r>
+    </w:p>
+    <w:p>
+      <w:r>
+        <w:drawing>
+          <wp:inline distT="0" distB="0" distL="0" distR="0" wp14:anchorId="3C792E65" wp14:editId="3A5D3AD4">
+            <wp:extent cx="152400" cy="152400"/>
+            <wp:effectExtent l="0" t="0" r="0" b="0"/>
+            <wp:docPr id="442718684" name="Picture 10"/>
+            <wp:cNvGraphicFramePr>
+              <a:graphicFrameLocks xmlns:a="http://schemas.openxmlformats.org/drawingml/2006/main" noChangeAspect="1"/>
+            </wp:cNvGraphicFramePr>
+            <a:graphic xmlns:a="http://schemas.openxmlformats.org/drawingml/2006/main">
+              <a:graphicData uri="http://schemas.openxmlformats.org/drawingml/2006/picture">
+                <pic:pic xmlns:pic="http://schemas.openxmlformats.org/drawingml/2006/picture">
+                  <pic:nvPicPr>
+                    <pic:cNvPr id="0" name="Picture 77"/>
+                    <pic:cNvPicPr>
+                      <a:picLocks noChangeAspect="1" noChangeArrowheads="1"/>
+                    </pic:cNvPicPr>
+                  </pic:nvPicPr>
+                  <pic:blipFill>
+                    <a:blip r:embed="rId152">
+                      <a:extLst>
+                        <a:ext uri="{28A0092B-C50C-407E-A947-70E740481C1C}">
+                          <a14:useLocalDpi xmlns:a14="http://schemas.microsoft.com/office/drawing/2010/main" val="0"/>
+                        </a:ext>
+                      </a:extLst>
+                    </a:blip>
+                    <a:srcRect/>
+                    <a:stretch>
+                      <a:fillRect/>
+                    </a:stretch>
+                  </pic:blipFill>
+                  <pic:spPr bwMode="auto">
+                    <a:xfrm>
+                      <a:off x="0" y="0"/>
+                      <a:ext cx="152400" cy="152400"/>
+                    </a:xfrm>
+                    <a:prstGeom prst="rect">
+                      <a:avLst/>
+                    </a:prstGeom>
+                    <a:noFill/>
+                    <a:ln>
+                      <a:noFill/>
+                    </a:ln>
+                  </pic:spPr>
+                </pic:pic>
+              </a:graphicData>
+            </a:graphic>
+          </wp:inline>
+        </w:drawing>
+      </w:r>
+    </w:p>
+    <w:p>
+      <w:r>
+        <w:t>Medium</w:t>
+      </w:r>
+    </w:p>
+    <w:p>
+      <w:r>
+        <w:t>Show all</w:t>
+      </w:r>
+    </w:p>
+    <w:p>
+      <w:r>
+        <w:t xml:space="preserve">You said: why </w:t>
+      </w:r>
+      <w:proofErr w:type="gramStart"/>
+      <w:r>
+        <w:t>Outside V8 Heap is</w:t>
+      </w:r>
+      <w:proofErr w:type="gramEnd"/>
+      <w:r>
+        <w:t xml:space="preserve"> used in buffer not inside v8?</w:t>
+      </w:r>
+    </w:p>
+    <w:p>
+      <w:r>
+        <w:t xml:space="preserve">Node.js allocates </w:t>
+      </w:r>
+      <w:r>
+        <w:rPr>
+          <w:b/>
+          <w:bCs/>
+        </w:rPr>
+        <w:t>Buffer</w:t>
+      </w:r>
+      <w:r>
+        <w:t xml:space="preserve"> data outside the V8 heap primarily for </w:t>
+      </w:r>
+      <w:r>
+        <w:rPr>
+          <w:b/>
+          <w:bCs/>
+        </w:rPr>
+        <w:t>performance, direct system access, and memory efficiency</w:t>
+      </w:r>
+      <w:r>
+        <w:t>. [</w:t>
+      </w:r>
+      <w:hyperlink r:id="rId153" w:history="1">
+        <w:r>
+          <w:rPr>
+            <w:rStyle w:val="Hyperlink"/>
+          </w:rPr>
+          <w:t>1</w:t>
+        </w:r>
+      </w:hyperlink>
+      <w:r>
+        <w:t>]</w:t>
+      </w:r>
+    </w:p>
+    <w:p>
+      <w:r>
+        <w:lastRenderedPageBreak/>
+        <w:t>If huge files and network data streams were stored inside the V8 heap, they would severely degrade your application's performance. [</w:t>
+      </w:r>
+      <w:hyperlink r:id="rId154" w:history="1">
+        <w:r>
+          <w:rPr>
+            <w:rStyle w:val="Hyperlink"/>
+          </w:rPr>
+          <w:t>1</w:t>
+        </w:r>
+      </w:hyperlink>
+      <w:r>
+        <w:t>]</w:t>
+      </w:r>
+    </w:p>
+    <w:p>
+      <w:r>
+        <w:pict w14:anchorId="0FF59DEE">
+          <v:rect id="_x0000_i1102" style="width:0;height:1.5pt" o:hralign="center" o:hrstd="t" o:hr="t" fillcolor="#a0a0a0" stroked="f"/>
+        </w:pict>
+      </w:r>
+    </w:p>
+    <w:p>
+      <w:pPr>
+        <w:rPr>
+          <w:b/>
+          <w:bCs/>
+        </w:rPr>
+      </w:pPr>
+      <w:r>
+        <w:rPr>
+          <w:b/>
+          <w:bCs/>
+        </w:rPr>
+        <w:t>Why Buffers Are Kept Outside V8</w:t>
+      </w:r>
+    </w:p>
+    <w:p>
+      <w:pPr>
+        <w:rPr>
+          <w:b/>
+          <w:bCs/>
+        </w:rPr>
+      </w:pPr>
+      <w:r>
+        <w:rPr>
+          <w:b/>
+          <w:bCs/>
+        </w:rPr>
+        <w:t>1. Bypassing the Garbage Collector (GC) [</w:t>
+      </w:r>
+      <w:hyperlink r:id="rId155" w:history="1">
+        <w:r>
+          <w:rPr>
+            <w:rStyle w:val="Hyperlink"/>
+            <w:b/>
+            <w:bCs/>
+          </w:rPr>
+          <w:t>1</w:t>
+        </w:r>
+      </w:hyperlink>
+      <w:r>
+        <w:rPr>
+          <w:b/>
+          <w:bCs/>
+        </w:rPr>
+        <w:t>]</w:t>
+      </w:r>
+    </w:p>
+    <w:p>
+      <w:r>
+        <w:t>The V8 Garbage Collector constantly pauses JavaScript execution to scan the heap, look for unused objects, and clean them up. [</w:t>
+      </w:r>
+      <w:hyperlink r:id="rId156" w:history="1">
+        <w:r>
+          <w:rPr>
+            <w:rStyle w:val="Hyperlink"/>
+          </w:rPr>
+          <w:t>1</w:t>
+        </w:r>
+      </w:hyperlink>
+      <w:r>
+        <w:t xml:space="preserve">, </w:t>
+      </w:r>
+      <w:hyperlink r:id="rId157" w:history="1">
+        <w:r>
+          <w:rPr>
+            <w:rStyle w:val="Hyperlink"/>
+          </w:rPr>
+          <w:t>2</w:t>
+        </w:r>
+      </w:hyperlink>
+      <w:r>
+        <w:t xml:space="preserve">, </w:t>
+      </w:r>
+      <w:hyperlink r:id="rId158" w:history="1">
+        <w:r>
+          <w:rPr>
+            <w:rStyle w:val="Hyperlink"/>
+          </w:rPr>
+          <w:t>3</w:t>
+        </w:r>
+      </w:hyperlink>
+      <w:r>
+        <w:t xml:space="preserve">, </w:t>
+      </w:r>
+      <w:hyperlink r:id="rId159" w:history="1">
+        <w:r>
+          <w:rPr>
+            <w:rStyle w:val="Hyperlink"/>
+          </w:rPr>
+          <w:t>4</w:t>
+        </w:r>
+      </w:hyperlink>
+      <w:r>
+        <w:t>]</w:t>
+      </w:r>
+    </w:p>
+    <w:p>
+      <w:pPr>
+        <w:numPr>
+          <w:ilvl w:val="0"/>
+          <w:numId w:val="18"/>
+        </w:numPr>
+      </w:pPr>
+      <w:r>
+        <w:rPr>
+          <w:b/>
+          <w:bCs/>
+        </w:rPr>
+        <w:t>Inside V8</w:t>
+      </w:r>
+      <w:r>
+        <w:t>: If you read a 1 GB video file into the V8 heap, the GC would have to look through millions of tiny memory segments, trying to see if that data needs cleaning. This causes massive "GC pauses" that freeze your application. [</w:t>
+      </w:r>
+      <w:hyperlink r:id="rId160" w:history="1">
+        <w:r>
+          <w:rPr>
+            <w:rStyle w:val="Hyperlink"/>
+          </w:rPr>
+          <w:t>1</w:t>
+        </w:r>
+      </w:hyperlink>
+      <w:r>
+        <w:t xml:space="preserve">, </w:t>
+      </w:r>
+      <w:hyperlink r:id="rId161" w:history="1">
+        <w:r>
+          <w:rPr>
+            <w:rStyle w:val="Hyperlink"/>
+          </w:rPr>
+          <w:t>2</w:t>
+        </w:r>
+      </w:hyperlink>
+      <w:r>
+        <w:t xml:space="preserve">, </w:t>
+      </w:r>
+      <w:hyperlink r:id="rId162" w:history="1">
+        <w:r>
+          <w:rPr>
+            <w:rStyle w:val="Hyperlink"/>
+          </w:rPr>
+          <w:t>3</w:t>
+        </w:r>
+      </w:hyperlink>
+      <w:r>
+        <w:t>]</w:t>
+      </w:r>
+    </w:p>
+    <w:p>
+      <w:pPr>
+        <w:numPr>
+          <w:ilvl w:val="0"/>
+          <w:numId w:val="18"/>
+        </w:numPr>
+      </w:pPr>
+      <w:r>
+        <w:rPr>
+          <w:b/>
+          <w:bCs/>
+        </w:rPr>
+        <w:t>Outside V8</w:t>
+      </w:r>
+      <w:r>
+        <w:t>: Off-heap memory is ignored by the V8 GC loop. The data sits quietly until Node.js explicitly frees it, preventing performance stuttering. [</w:t>
+      </w:r>
+      <w:hyperlink r:id="rId163" w:history="1">
+        <w:r>
+          <w:rPr>
+            <w:rStyle w:val="Hyperlink"/>
+          </w:rPr>
+          <w:t>1</w:t>
+        </w:r>
+      </w:hyperlink>
+      <w:r>
+        <w:t xml:space="preserve">, </w:t>
+      </w:r>
+      <w:hyperlink r:id="rId164" w:history="1">
+        <w:r>
+          <w:rPr>
+            <w:rStyle w:val="Hyperlink"/>
+          </w:rPr>
+          <w:t>3</w:t>
+        </w:r>
+      </w:hyperlink>
+      <w:r>
+        <w:t xml:space="preserve">, </w:t>
+      </w:r>
+      <w:hyperlink r:id="rId165" w:history="1">
+        <w:r>
+          <w:rPr>
+            <w:rStyle w:val="Hyperlink"/>
+          </w:rPr>
+          <w:t>4</w:t>
+        </w:r>
+      </w:hyperlink>
+      <w:r>
+        <w:t>]</w:t>
+      </w:r>
+    </w:p>
+    <w:p>
+      <w:pPr>
+        <w:rPr>
+          <w:b/>
+          <w:bCs/>
+        </w:rPr>
+      </w:pPr>
+      <w:r>
+        <w:rPr>
+          <w:b/>
+          <w:bCs/>
+        </w:rPr>
+        <w:t>2. Zero-Copy I/O with the Operating System [</w:t>
+      </w:r>
+      <w:hyperlink r:id="rId166" w:history="1">
+        <w:r>
+          <w:rPr>
+            <w:rStyle w:val="Hyperlink"/>
+            <w:b/>
+            <w:bCs/>
+          </w:rPr>
+          <w:t>1</w:t>
+        </w:r>
+      </w:hyperlink>
+      <w:r>
+        <w:rPr>
+          <w:b/>
+          <w:bCs/>
+        </w:rPr>
+        <w:t>]</w:t>
+      </w:r>
+    </w:p>
+    <w:p>
+      <w:r>
+        <w:t>Node.js interacts with your computer's hardware (hard drives, network cards) via low-level C++ systems.</w:t>
+      </w:r>
+    </w:p>
+    <w:p>
+      <w:pPr>
+        <w:numPr>
+          <w:ilvl w:val="0"/>
+          <w:numId w:val="19"/>
+        </w:numPr>
+      </w:pPr>
+      <w:r>
+        <w:rPr>
+          <w:b/>
+          <w:bCs/>
+        </w:rPr>
+        <w:t>Inside V8</w:t>
+      </w:r>
+      <w:r>
+        <w:t xml:space="preserve">: To send a file over a network, the OS would read the data, C++ would copy it, and then it would have to be copied </w:t>
+      </w:r>
+      <w:r>
+        <w:rPr>
+          <w:i/>
+          <w:iCs/>
+        </w:rPr>
+        <w:t>again</w:t>
+      </w:r>
+      <w:r>
+        <w:t xml:space="preserve"> into V8's special internal object format. [</w:t>
+      </w:r>
+      <w:hyperlink r:id="rId167" w:history="1">
+        <w:r>
+          <w:rPr>
+            <w:rStyle w:val="Hyperlink"/>
+          </w:rPr>
+          <w:t>1</w:t>
+        </w:r>
+      </w:hyperlink>
+      <w:r>
+        <w:t>]</w:t>
+      </w:r>
+    </w:p>
+    <w:p>
+      <w:pPr>
+        <w:numPr>
+          <w:ilvl w:val="0"/>
+          <w:numId w:val="19"/>
+        </w:numPr>
+      </w:pPr>
+      <w:r>
+        <w:rPr>
+          <w:b/>
+          <w:bCs/>
+        </w:rPr>
+        <w:t>Outside V8</w:t>
+      </w:r>
+      <w:r>
+        <w:t>: A Buffer is just raw, standard binary memory allocated directly from the OS. The C++ network layer can read from and write to this memory space directly with zero copying, making file transfers and streaming lightning fast. [</w:t>
+      </w:r>
+      <w:hyperlink r:id="rId168" w:history="1">
+        <w:r>
+          <w:rPr>
+            <w:rStyle w:val="Hyperlink"/>
+          </w:rPr>
+          <w:t>1</w:t>
+        </w:r>
+      </w:hyperlink>
+      <w:r>
+        <w:t xml:space="preserve">, </w:t>
+      </w:r>
+      <w:hyperlink r:id="rId169" w:history="1">
+        <w:r>
+          <w:rPr>
+            <w:rStyle w:val="Hyperlink"/>
+          </w:rPr>
+          <w:t>2</w:t>
+        </w:r>
+      </w:hyperlink>
+      <w:r>
+        <w:t xml:space="preserve">, </w:t>
+      </w:r>
+      <w:hyperlink r:id="rId170" w:history="1">
+        <w:r>
+          <w:rPr>
+            <w:rStyle w:val="Hyperlink"/>
+          </w:rPr>
+          <w:t>3</w:t>
+        </w:r>
+      </w:hyperlink>
+      <w:r>
+        <w:t>]</w:t>
+      </w:r>
+    </w:p>
+    <w:p>
+      <w:pPr>
+        <w:rPr>
+          <w:b/>
+          <w:bCs/>
+        </w:rPr>
+      </w:pPr>
+      <w:r>
+        <w:rPr>
+          <w:b/>
+          <w:bCs/>
+        </w:rPr>
+        <w:t>3. Overcoming V8 Heap Size Limits [</w:t>
+      </w:r>
+      <w:hyperlink r:id="rId171" w:history="1">
+        <w:r>
+          <w:rPr>
+            <w:rStyle w:val="Hyperlink"/>
+            <w:b/>
+            <w:bCs/>
+          </w:rPr>
+          <w:t>1</w:t>
+        </w:r>
+      </w:hyperlink>
+      <w:r>
+        <w:rPr>
+          <w:b/>
+          <w:bCs/>
+        </w:rPr>
+        <w:t>]</w:t>
+      </w:r>
+    </w:p>
+    <w:p>
+      <w:r>
+        <w:t xml:space="preserve">By default, the V8 heap has strict artificial limits (often around 1.4 GB to 4 GB depending on the system and configuration). [, </w:t>
+      </w:r>
+      <w:hyperlink r:id="rId172" w:history="1">
+        <w:r>
+          <w:rPr>
+            <w:rStyle w:val="Hyperlink"/>
+          </w:rPr>
+          <w:t>2</w:t>
+        </w:r>
+      </w:hyperlink>
+      <w:r>
+        <w:t xml:space="preserve">, </w:t>
+      </w:r>
+      <w:hyperlink r:id="rId173" w:history="1">
+        <w:r>
+          <w:rPr>
+            <w:rStyle w:val="Hyperlink"/>
+          </w:rPr>
+          <w:t>3</w:t>
+        </w:r>
+      </w:hyperlink>
+      <w:r>
+        <w:t xml:space="preserve">, </w:t>
+      </w:r>
+      <w:hyperlink r:id="rId174" w:history="1">
+        <w:r>
+          <w:rPr>
+            <w:rStyle w:val="Hyperlink"/>
+          </w:rPr>
+          <w:t>4</w:t>
+        </w:r>
+      </w:hyperlink>
+      <w:r>
+        <w:t>]</w:t>
+      </w:r>
+    </w:p>
+    <w:p>
+      <w:pPr>
+        <w:numPr>
+          <w:ilvl w:val="0"/>
+          <w:numId w:val="20"/>
+        </w:numPr>
+      </w:pPr>
+      <w:r>
+        <w:rPr>
+          <w:b/>
+          <w:bCs/>
+        </w:rPr>
+        <w:t>Inside V8</w:t>
+      </w:r>
+      <w:r>
+        <w:t xml:space="preserve">: Processing a 5 GB database dump inside the V8 heap would trigger an instant </w:t>
+      </w:r>
+      <w:r>
+        <w:rPr>
+          <w:b/>
+          <w:bCs/>
+        </w:rPr>
+        <w:t>"Out of Memory" (OOM)</w:t>
+      </w:r>
+      <w:r>
+        <w:t xml:space="preserve"> crash.</w:t>
+      </w:r>
+    </w:p>
+    <w:p>
+      <w:pPr>
+        <w:numPr>
+          <w:ilvl w:val="0"/>
+          <w:numId w:val="20"/>
+        </w:numPr>
+      </w:pPr>
+      <w:r>
+        <w:rPr>
+          <w:b/>
+          <w:bCs/>
+        </w:rPr>
+        <w:t>Outside V8</w:t>
+      </w:r>
+      <w:r>
+        <w:t>: Buffers can use up all available physical RAM on the machine, entirely unconstrained by V8's internal limits.</w:t>
+      </w:r>
+    </w:p>
+    <w:p>
+      <w:r>
+        <w:pict w14:anchorId="5CB860A4">
+          <v:rect id="_x0000_i1103" style="width:0;height:1.5pt" o:hralign="center" o:hrstd="t" o:hr="t" fillcolor="#a0a0a0" stroked="f"/>
+        </w:pict>
+      </w:r>
+    </w:p>
+    <w:p>
+      <w:pPr>
+        <w:rPr>
+          <w:b/>
+          <w:bCs/>
+        </w:rPr>
+      </w:pPr>
+      <w:r>
+        <w:rPr>
+          <w:b/>
+          <w:bCs/>
+        </w:rPr>
+        <w:t>How they connect: The "Shadow" Pattern</w:t>
+      </w:r>
+    </w:p>
+    <w:p>
+      <w:r>
+        <w:lastRenderedPageBreak/>
+        <w:t>Even though the actual binary data lives outside V8, you can still interact with it in JavaScript. Node.js achieves this using a split architecture: [</w:t>
+      </w:r>
+      <w:hyperlink r:id="rId175" w:history="1">
+        <w:r>
+          <w:rPr>
+            <w:rStyle w:val="Hyperlink"/>
+          </w:rPr>
+          <w:t>1</w:t>
+        </w:r>
+      </w:hyperlink>
+      <w:r>
+        <w:t>]</w:t>
+      </w:r>
+    </w:p>
+    <w:p>
+      <w:r>
+        <w:t xml:space="preserve">    </w:t>
+      </w:r>
+      <w:proofErr w:type="gramStart"/>
+      <w:r>
+        <w:t>[ V8</w:t>
+      </w:r>
+      <w:proofErr w:type="gramEnd"/>
+      <w:r>
+        <w:t xml:space="preserve"> JavaScript </w:t>
+      </w:r>
+      <w:proofErr w:type="gramStart"/>
+      <w:r>
+        <w:t>Heap ]</w:t>
+      </w:r>
+      <w:proofErr w:type="gramEnd"/>
+      <w:r>
+        <w:t xml:space="preserve">           </w:t>
+      </w:r>
+      <w:proofErr w:type="gramStart"/>
+      <w:r>
+        <w:t xml:space="preserve">   [</w:t>
+      </w:r>
+      <w:proofErr w:type="gramEnd"/>
+      <w:r>
+        <w:t xml:space="preserve"> System Memory (Off-Heap</w:t>
+      </w:r>
+      <w:proofErr w:type="gramStart"/>
+      <w:r>
+        <w:t>) ]</w:t>
+      </w:r>
+      <w:proofErr w:type="gramEnd"/>
+    </w:p>
+    <w:p>
+      <w:r>
+        <w:t>┌────────────────────────────┐         ┌────────────────────────────┐</w:t>
+      </w:r>
+    </w:p>
+    <w:p>
+      <w:proofErr w:type="gramStart"/>
+      <w:r>
+        <w:t xml:space="preserve">│  </w:t>
+      </w:r>
+      <w:proofErr w:type="spellStart"/>
+      <w:r>
+        <w:t>jsBufferObject</w:t>
+      </w:r>
+      <w:proofErr w:type="spellEnd"/>
+      <w:proofErr w:type="gramEnd"/>
+      <w:r>
+        <w:t xml:space="preserve">            │         │                            │</w:t>
+      </w:r>
+    </w:p>
+    <w:p>
+      <w:proofErr w:type="gramStart"/>
+      <w:r>
+        <w:t>│  {</w:t>
+      </w:r>
+      <w:proofErr w:type="gramEnd"/>
+      <w:r>
+        <w:t xml:space="preserve">                         │         │   10101001 00111010        │</w:t>
+      </w:r>
+    </w:p>
+    <w:p>
+      <w:r>
+        <w:t xml:space="preserve">│    </w:t>
+      </w:r>
+      <w:proofErr w:type="spellStart"/>
+      <w:r>
+        <w:t>memoryAddress</w:t>
+      </w:r>
+      <w:proofErr w:type="spellEnd"/>
+      <w:r>
+        <w:t>: 0x7FFF ──</w:t>
+      </w:r>
+      <w:r>
+        <w:rPr>
+          <w:rFonts w:ascii="MS Gothic" w:eastAsia="MS Gothic" w:hAnsi="MS Gothic" w:cs="MS Gothic" w:hint="eastAsia"/>
+        </w:rPr>
+        <w:t>┼</w:t>
+      </w:r>
+      <w:r>
+        <w:rPr>
+          <w:rFonts w:ascii="Aptos" w:hAnsi="Aptos" w:cs="Aptos"/>
+        </w:rPr>
+        <w:t>────────</w:t>
+      </w:r>
+      <w:r>
+        <w:t>&gt;</w:t>
+      </w:r>
+      <w:r>
+        <w:rPr>
+          <w:rFonts w:ascii="Aptos" w:hAnsi="Aptos" w:cs="Aptos"/>
+        </w:rPr>
+        <w:t>│</w:t>
+      </w:r>
+      <w:r>
+        <w:t xml:space="preserve">   11001101 11100001        </w:t>
+      </w:r>
+      <w:r>
+        <w:rPr>
+          <w:rFonts w:ascii="Aptos" w:hAnsi="Aptos" w:cs="Aptos"/>
+        </w:rPr>
+        <w:t>│</w:t>
+      </w:r>
+    </w:p>
+    <w:p>
+      <w:proofErr w:type="gramStart"/>
+      <w:r>
+        <w:t>│  }</w:t>
+      </w:r>
+      <w:proofErr w:type="gramEnd"/>
+      <w:r>
+        <w:t xml:space="preserve">                         │         │</w:t>
+      </w:r>
+      <w:proofErr w:type="gramStart"/>
+      <w:r>
+        <w:t xml:space="preserve">   (</w:t>
+      </w:r>
+      <w:proofErr w:type="gramEnd"/>
+      <w:r>
+        <w:t xml:space="preserve">Raw Binary File </w:t>
+      </w:r>
+      <w:proofErr w:type="gramStart"/>
+      <w:r>
+        <w:t xml:space="preserve">Data)   </w:t>
+      </w:r>
+      <w:proofErr w:type="gramEnd"/>
+      <w:r>
+        <w:t>│</w:t>
+      </w:r>
+    </w:p>
+    <w:p>
+      <w:r>
+        <w:t>└────────────────────────────┘         └────────────────────────────┘</w:t>
+      </w:r>
+    </w:p>
+    <w:p>
+      <w:r>
+        <w:t xml:space="preserve"> (Tiny JavaScript </w:t>
+      </w:r>
+      <w:proofErr w:type="gramStart"/>
+      <w:r>
+        <w:t xml:space="preserve">wrapper,   </w:t>
+      </w:r>
+      <w:proofErr w:type="gramEnd"/>
+      <w:r>
+        <w:t xml:space="preserve">        </w:t>
+      </w:r>
+      <w:proofErr w:type="gramStart"/>
+      <w:r>
+        <w:t xml:space="preserve">   (</w:t>
+      </w:r>
+      <w:proofErr w:type="gramEnd"/>
+      <w:r>
+        <w:t xml:space="preserve">Massive raw chunk of bytes, </w:t>
+      </w:r>
+    </w:p>
+    <w:p>
+      <w:r>
+        <w:t xml:space="preserve">  scanned by V8 </w:t>
+      </w:r>
+      <w:proofErr w:type="gramStart"/>
+      <w:r>
+        <w:t xml:space="preserve">GC)   </w:t>
+      </w:r>
+      <w:proofErr w:type="gramEnd"/>
+      <w:r>
+        <w:t xml:space="preserve">                   ignored by V8 GC)</w:t>
+      </w:r>
+    </w:p>
+    <w:p>
+      <w:r>
+        <w:t xml:space="preserve">When you type </w:t>
+      </w:r>
+      <w:proofErr w:type="spellStart"/>
+      <w:proofErr w:type="gramStart"/>
+      <w:r>
+        <w:t>buffer.toString</w:t>
+      </w:r>
+      <w:proofErr w:type="spellEnd"/>
+      <w:proofErr w:type="gramEnd"/>
+      <w:r>
+        <w:t>(), V8 doesn't hold the raw bytes. It just holds a tiny "pointer" object containing the memory address of where the real data lives outside the heap. [</w:t>
+      </w:r>
+      <w:hyperlink r:id="rId176" w:history="1">
+        <w:r>
+          <w:rPr>
+            <w:rStyle w:val="Hyperlink"/>
+          </w:rPr>
+          <w:t>1</w:t>
+        </w:r>
+      </w:hyperlink>
+      <w:r>
+        <w:t xml:space="preserve">, </w:t>
+      </w:r>
+      <w:hyperlink r:id="rId177" w:history="1">
+        <w:r>
+          <w:rPr>
+            <w:rStyle w:val="Hyperlink"/>
+          </w:rPr>
+          <w:t>3</w:t>
+        </w:r>
+      </w:hyperlink>
+      <w:r>
+        <w:t>]</w:t>
+      </w:r>
+    </w:p>
+    <w:p>
+      <w:r>
+        <w:t xml:space="preserve">Would you like to see </w:t>
+      </w:r>
+      <w:r>
+        <w:rPr>
+          <w:b/>
+          <w:bCs/>
+        </w:rPr>
+        <w:t>code examples</w:t>
+      </w:r>
+      <w:r>
+        <w:t xml:space="preserve"> demonstrating how to process massive files using </w:t>
+      </w:r>
+      <w:proofErr w:type="gramStart"/>
+      <w:r>
+        <w:rPr>
+          <w:b/>
+          <w:bCs/>
+        </w:rPr>
+        <w:t>Streams</w:t>
+      </w:r>
+      <w:proofErr w:type="gramEnd"/>
+      <w:r>
+        <w:t xml:space="preserve"> so you don't overwhelm your off-heap memory, or are you looking to debug a specific </w:t>
+      </w:r>
+      <w:r>
+        <w:rPr>
+          <w:b/>
+          <w:bCs/>
+        </w:rPr>
+        <w:t>memory leak</w:t>
+      </w:r>
+      <w:r>
+        <w:t>?</w:t>
+      </w:r>
+    </w:p>
+    <w:p/>
     <w:p/>
     <w:p/>
     <w:sectPr>
@@ -5358,6 +7567,119 @@
 <file path=word/numbering.xml><?xml version="1.0" encoding="utf-8"?>
 <w:numbering xmlns:wpc="http://schemas.microsoft.com/office/word/2010/wordprocessingCanvas" xmlns:cx="http://schemas.microsoft.com/office/drawing/2014/chartex" xmlns:cx1="http://schemas.microsoft.com/office/drawing/2015/9/8/chartex" xmlns:cx2="http://schemas.microsoft.com/office/drawing/2015/10/21/chartex" xmlns:cx3="http://schemas.microsoft.com/office/drawing/2016/5/9/chartex" xmlns:cx4="http://schemas.microsoft.com/office/drawing/2016/5/10/chartex" xmlns:cx5="http://schemas.microsoft.com/office/drawing/2016/5/11/chartex" xmlns:cx6="http://schemas.microsoft.com/office/drawing/2016/5/12/chartex" xmlns:cx7="http://schemas.microsoft.com/office/drawing/2016/5/13/chartex" xmlns:cx8="http://schemas.microsoft.com/office/drawing/2016/5/14/chartex" xmlns:mc="http://schemas.openxmlformats.org/markup-compatibility/2006" xmlns:aink="http://schemas.microsoft.com/office/drawing/2016/ink" xmlns:am3d="http://schemas.microsoft.com/office/drawing/2017/model3d" xmlns:o="urn:schemas-microsoft-com:office:office" xmlns:oel="http://schemas.microsoft.com/office/2019/extlst" xmlns:r="http://schemas.openxmlformats.org/officeDocument/2006/relationships" xmlns:m="http://schemas.openxmlformats.org/officeDocument/2006/math" xmlns:v="urn:schemas-microsoft-com:vml" xmlns:wp14="http://schemas.microsoft.com/office/word/2010/wordprocessingDrawing" xmlns:wp="http://schemas.openxmlformats.org/drawingml/2006/wordprocessingDrawing" xmlns:w10="urn:schemas-microsoft-com:office:word" xmlns:w="http://schemas.openxmlformats.org/wordprocessingml/2006/main" xmlns:w14="http://schemas.microsoft.com/office/word/2010/wordml" xmlns:w15="http://schemas.microsoft.com/office/word/2012/wordml" xmlns:w16cex="http://schemas.microsoft.com/office/word/2018/wordml/cex" xmlns:w16cid="http://schemas.microsoft.com/office/word/2016/wordml/cid" xmlns:w16="http://schemas.microsoft.com/office/word/2018/wordml" xmlns:w16du="http://schemas.microsoft.com/office/word/2023/wordml/word16du" xmlns:w16sdtdh="http://schemas.microsoft.com/office/word/2020/wordml/sdtdatahash" xmlns:w16sdtfl="http://schemas.microsoft.com/office/word/2024/wordml/sdtformatlock" xmlns:w16se="http://schemas.microsoft.com/office/word/2015/wordml/symex" xmlns:wpg="http://schemas.microsoft.com/office/word/2010/wordprocessingGroup" xmlns:wpi="http://schemas.microsoft.com/office/word/2010/wordprocessingInk" xmlns:wne="http://schemas.microsoft.com/office/word/2006/wordml" xmlns:wps="http://schemas.microsoft.com/office/word/2010/wordprocessingShape" mc:Ignorable="w14 w15 w16se w16cid w16 w16cex w16sdtdh w16sdtfl w16du wp14">
   <w:abstractNum w:abstractNumId="0" w15:restartNumberingAfterBreak="0">
+    <w:nsid w:val="064251FF"/>
+    <w:multiLevelType w:val="multilevel"/>
+    <w:tmpl w:val="D9147254"/>
+    <w:lvl w:ilvl="0">
+      <w:start w:val="1"/>
+      <w:numFmt w:val="decimal"/>
+      <w:lvlText w:val="%1."/>
+      <w:lvlJc w:val="left"/>
+      <w:pPr>
+        <w:tabs>
+          <w:tab w:val="num" w:pos="720"/>
+        </w:tabs>
+        <w:ind w:left="720" w:hanging="360"/>
+      </w:pPr>
+    </w:lvl>
+    <w:lvl w:ilvl="1" w:tentative="1">
+      <w:start w:val="1"/>
+      <w:numFmt w:val="decimal"/>
+      <w:lvlText w:val="%2."/>
+      <w:lvlJc w:val="left"/>
+      <w:pPr>
+        <w:tabs>
+          <w:tab w:val="num" w:pos="1440"/>
+        </w:tabs>
+        <w:ind w:left="1440" w:hanging="360"/>
+      </w:pPr>
+    </w:lvl>
+    <w:lvl w:ilvl="2" w:tentative="1">
+      <w:start w:val="1"/>
+      <w:numFmt w:val="decimal"/>
+      <w:lvlText w:val="%3."/>
+      <w:lvlJc w:val="left"/>
+      <w:pPr>
+        <w:tabs>
+          <w:tab w:val="num" w:pos="2160"/>
+        </w:tabs>
+        <w:ind w:left="2160" w:hanging="360"/>
+      </w:pPr>
+    </w:lvl>
+    <w:lvl w:ilvl="3" w:tentative="1">
+      <w:start w:val="1"/>
+      <w:numFmt w:val="decimal"/>
+      <w:lvlText w:val="%4."/>
+      <w:lvlJc w:val="left"/>
+      <w:pPr>
+        <w:tabs>
+          <w:tab w:val="num" w:pos="2880"/>
+        </w:tabs>
+        <w:ind w:left="2880" w:hanging="360"/>
+      </w:pPr>
+    </w:lvl>
+    <w:lvl w:ilvl="4" w:tentative="1">
+      <w:start w:val="1"/>
+      <w:numFmt w:val="decimal"/>
+      <w:lvlText w:val="%5."/>
+      <w:lvlJc w:val="left"/>
+      <w:pPr>
+        <w:tabs>
+          <w:tab w:val="num" w:pos="3600"/>
+        </w:tabs>
+        <w:ind w:left="3600" w:hanging="360"/>
+      </w:pPr>
+    </w:lvl>
+    <w:lvl w:ilvl="5" w:tentative="1">
+      <w:start w:val="1"/>
+      <w:numFmt w:val="decimal"/>
+      <w:lvlText w:val="%6."/>
+      <w:lvlJc w:val="left"/>
+      <w:pPr>
+        <w:tabs>
+          <w:tab w:val="num" w:pos="4320"/>
+        </w:tabs>
+        <w:ind w:left="4320" w:hanging="360"/>
+      </w:pPr>
+    </w:lvl>
+    <w:lvl w:ilvl="6" w:tentative="1">
+      <w:start w:val="1"/>
+      <w:numFmt w:val="decimal"/>
+      <w:lvlText w:val="%7."/>
+      <w:lvlJc w:val="left"/>
+      <w:pPr>
+        <w:tabs>
+          <w:tab w:val="num" w:pos="5040"/>
+        </w:tabs>
+        <w:ind w:left="5040" w:hanging="360"/>
+      </w:pPr>
+    </w:lvl>
+    <w:lvl w:ilvl="7" w:tentative="1">
+      <w:start w:val="1"/>
+      <w:numFmt w:val="decimal"/>
+      <w:lvlText w:val="%8."/>
+      <w:lvlJc w:val="left"/>
+      <w:pPr>
+        <w:tabs>
+          <w:tab w:val="num" w:pos="5760"/>
+        </w:tabs>
+        <w:ind w:left="5760" w:hanging="360"/>
+      </w:pPr>
+    </w:lvl>
+    <w:lvl w:ilvl="8" w:tentative="1">
+      <w:start w:val="1"/>
+      <w:numFmt w:val="decimal"/>
+      <w:lvlText w:val="%9."/>
+      <w:lvlJc w:val="left"/>
+      <w:pPr>
+        <w:tabs>
+          <w:tab w:val="num" w:pos="6480"/>
+        </w:tabs>
+        <w:ind w:left="6480" w:hanging="360"/>
+      </w:pPr>
+    </w:lvl>
+  </w:abstractNum>
+  <w:abstractNum w:abstractNumId="1" w15:restartNumberingAfterBreak="0">
     <w:nsid w:val="089D18E2"/>
     <w:multiLevelType w:val="multilevel"/>
     <w:tmpl w:val="A75C265A"/>
@@ -5506,7 +7828,7 @@
       </w:rPr>
     </w:lvl>
   </w:abstractNum>
-  <w:abstractNum w:abstractNumId="1" w15:restartNumberingAfterBreak="0">
+  <w:abstractNum w:abstractNumId="2" w15:restartNumberingAfterBreak="0">
     <w:nsid w:val="1C324F13"/>
     <w:multiLevelType w:val="multilevel"/>
     <w:tmpl w:val="C8E6D6D4"/>
@@ -5655,7 +7977,7 @@
       </w:rPr>
     </w:lvl>
   </w:abstractNum>
-  <w:abstractNum w:abstractNumId="2" w15:restartNumberingAfterBreak="0">
+  <w:abstractNum w:abstractNumId="3" w15:restartNumberingAfterBreak="0">
     <w:nsid w:val="26E67517"/>
     <w:multiLevelType w:val="multilevel"/>
     <w:tmpl w:val="64EC4770"/>
@@ -5804,7 +8126,7 @@
       </w:rPr>
     </w:lvl>
   </w:abstractNum>
-  <w:abstractNum w:abstractNumId="3" w15:restartNumberingAfterBreak="0">
+  <w:abstractNum w:abstractNumId="4" w15:restartNumberingAfterBreak="0">
     <w:nsid w:val="28061E79"/>
     <w:multiLevelType w:val="multilevel"/>
     <w:tmpl w:val="9A66D134"/>
@@ -5917,7 +8239,156 @@
       </w:pPr>
     </w:lvl>
   </w:abstractNum>
-  <w:abstractNum w:abstractNumId="4" w15:restartNumberingAfterBreak="0">
+  <w:abstractNum w:abstractNumId="5" w15:restartNumberingAfterBreak="0">
+    <w:nsid w:val="2E775A1B"/>
+    <w:multiLevelType w:val="multilevel"/>
+    <w:tmpl w:val="1E06171E"/>
+    <w:lvl w:ilvl="0">
+      <w:start w:val="1"/>
+      <w:numFmt w:val="bullet"/>
+      <w:lvlText w:val=""/>
+      <w:lvlJc w:val="left"/>
+      <w:pPr>
+        <w:tabs>
+          <w:tab w:val="num" w:pos="720"/>
+        </w:tabs>
+        <w:ind w:left="720" w:hanging="360"/>
+      </w:pPr>
+      <w:rPr>
+        <w:rFonts w:ascii="Symbol" w:hAnsi="Symbol" w:hint="default"/>
+        <w:sz w:val="20"/>
+      </w:rPr>
+    </w:lvl>
+    <w:lvl w:ilvl="1" w:tentative="1">
+      <w:start w:val="1"/>
+      <w:numFmt w:val="bullet"/>
+      <w:lvlText w:val="o"/>
+      <w:lvlJc w:val="left"/>
+      <w:pPr>
+        <w:tabs>
+          <w:tab w:val="num" w:pos="1440"/>
+        </w:tabs>
+        <w:ind w:left="1440" w:hanging="360"/>
+      </w:pPr>
+      <w:rPr>
+        <w:rFonts w:ascii="Courier New" w:hAnsi="Courier New" w:hint="default"/>
+        <w:sz w:val="20"/>
+      </w:rPr>
+    </w:lvl>
+    <w:lvl w:ilvl="2" w:tentative="1">
+      <w:start w:val="1"/>
+      <w:numFmt w:val="bullet"/>
+      <w:lvlText w:val=""/>
+      <w:lvlJc w:val="left"/>
+      <w:pPr>
+        <w:tabs>
+          <w:tab w:val="num" w:pos="2160"/>
+        </w:tabs>
+        <w:ind w:left="2160" w:hanging="360"/>
+      </w:pPr>
+      <w:rPr>
+        <w:rFonts w:ascii="Wingdings" w:hAnsi="Wingdings" w:hint="default"/>
+        <w:sz w:val="20"/>
+      </w:rPr>
+    </w:lvl>
+    <w:lvl w:ilvl="3" w:tentative="1">
+      <w:start w:val="1"/>
+      <w:numFmt w:val="bullet"/>
+      <w:lvlText w:val=""/>
+      <w:lvlJc w:val="left"/>
+      <w:pPr>
+        <w:tabs>
+          <w:tab w:val="num" w:pos="2880"/>
+        </w:tabs>
+        <w:ind w:left="2880" w:hanging="360"/>
+      </w:pPr>
+      <w:rPr>
+        <w:rFonts w:ascii="Wingdings" w:hAnsi="Wingdings" w:hint="default"/>
+        <w:sz w:val="20"/>
+      </w:rPr>
+    </w:lvl>
+    <w:lvl w:ilvl="4" w:tentative="1">
+      <w:start w:val="1"/>
+      <w:numFmt w:val="bullet"/>
+      <w:lvlText w:val=""/>
+      <w:lvlJc w:val="left"/>
+      <w:pPr>
+        <w:tabs>
+          <w:tab w:val="num" w:pos="3600"/>
+        </w:tabs>
+        <w:ind w:left="3600" w:hanging="360"/>
+      </w:pPr>
+      <w:rPr>
+        <w:rFonts w:ascii="Wingdings" w:hAnsi="Wingdings" w:hint="default"/>
+        <w:sz w:val="20"/>
+      </w:rPr>
+    </w:lvl>
+    <w:lvl w:ilvl="5" w:tentative="1">
+      <w:start w:val="1"/>
+      <w:numFmt w:val="bullet"/>
+      <w:lvlText w:val=""/>
+      <w:lvlJc w:val="left"/>
+      <w:pPr>
+        <w:tabs>
+          <w:tab w:val="num" w:pos="4320"/>
+        </w:tabs>
+        <w:ind w:left="4320" w:hanging="360"/>
+      </w:pPr>
+      <w:rPr>
+        <w:rFonts w:ascii="Wingdings" w:hAnsi="Wingdings" w:hint="default"/>
+        <w:sz w:val="20"/>
+      </w:rPr>
+    </w:lvl>
+    <w:lvl w:ilvl="6" w:tentative="1">
+      <w:start w:val="1"/>
+      <w:numFmt w:val="bullet"/>
+      <w:lvlText w:val=""/>
+      <w:lvlJc w:val="left"/>
+      <w:pPr>
+        <w:tabs>
+          <w:tab w:val="num" w:pos="5040"/>
+        </w:tabs>
+        <w:ind w:left="5040" w:hanging="360"/>
+      </w:pPr>
+      <w:rPr>
+        <w:rFonts w:ascii="Wingdings" w:hAnsi="Wingdings" w:hint="default"/>
+        <w:sz w:val="20"/>
+      </w:rPr>
+    </w:lvl>
+    <w:lvl w:ilvl="7" w:tentative="1">
+      <w:start w:val="1"/>
+      <w:numFmt w:val="bullet"/>
+      <w:lvlText w:val=""/>
+      <w:lvlJc w:val="left"/>
+      <w:pPr>
+        <w:tabs>
+          <w:tab w:val="num" w:pos="5760"/>
+        </w:tabs>
+        <w:ind w:left="5760" w:hanging="360"/>
+      </w:pPr>
+      <w:rPr>
+        <w:rFonts w:ascii="Wingdings" w:hAnsi="Wingdings" w:hint="default"/>
+        <w:sz w:val="20"/>
+      </w:rPr>
+    </w:lvl>
+    <w:lvl w:ilvl="8" w:tentative="1">
+      <w:start w:val="1"/>
+      <w:numFmt w:val="bullet"/>
+      <w:lvlText w:val=""/>
+      <w:lvlJc w:val="left"/>
+      <w:pPr>
+        <w:tabs>
+          <w:tab w:val="num" w:pos="6480"/>
+        </w:tabs>
+        <w:ind w:left="6480" w:hanging="360"/>
+      </w:pPr>
+      <w:rPr>
+        <w:rFonts w:ascii="Wingdings" w:hAnsi="Wingdings" w:hint="default"/>
+        <w:sz w:val="20"/>
+      </w:rPr>
+    </w:lvl>
+  </w:abstractNum>
+  <w:abstractNum w:abstractNumId="6" w15:restartNumberingAfterBreak="0">
     <w:nsid w:val="38130302"/>
     <w:multiLevelType w:val="multilevel"/>
     <w:tmpl w:val="0F4C5292"/>
@@ -6066,7 +8537,454 @@
       </w:rPr>
     </w:lvl>
   </w:abstractNum>
-  <w:abstractNum w:abstractNumId="5" w15:restartNumberingAfterBreak="0">
+  <w:abstractNum w:abstractNumId="7" w15:restartNumberingAfterBreak="0">
+    <w:nsid w:val="3C8A4A6E"/>
+    <w:multiLevelType w:val="multilevel"/>
+    <w:tmpl w:val="684817B0"/>
+    <w:lvl w:ilvl="0">
+      <w:start w:val="1"/>
+      <w:numFmt w:val="bullet"/>
+      <w:lvlText w:val=""/>
+      <w:lvlJc w:val="left"/>
+      <w:pPr>
+        <w:tabs>
+          <w:tab w:val="num" w:pos="720"/>
+        </w:tabs>
+        <w:ind w:left="720" w:hanging="360"/>
+      </w:pPr>
+      <w:rPr>
+        <w:rFonts w:ascii="Symbol" w:hAnsi="Symbol" w:hint="default"/>
+        <w:sz w:val="20"/>
+      </w:rPr>
+    </w:lvl>
+    <w:lvl w:ilvl="1" w:tentative="1">
+      <w:start w:val="1"/>
+      <w:numFmt w:val="bullet"/>
+      <w:lvlText w:val="o"/>
+      <w:lvlJc w:val="left"/>
+      <w:pPr>
+        <w:tabs>
+          <w:tab w:val="num" w:pos="1440"/>
+        </w:tabs>
+        <w:ind w:left="1440" w:hanging="360"/>
+      </w:pPr>
+      <w:rPr>
+        <w:rFonts w:ascii="Courier New" w:hAnsi="Courier New" w:hint="default"/>
+        <w:sz w:val="20"/>
+      </w:rPr>
+    </w:lvl>
+    <w:lvl w:ilvl="2" w:tentative="1">
+      <w:start w:val="1"/>
+      <w:numFmt w:val="bullet"/>
+      <w:lvlText w:val=""/>
+      <w:lvlJc w:val="left"/>
+      <w:pPr>
+        <w:tabs>
+          <w:tab w:val="num" w:pos="2160"/>
+        </w:tabs>
+        <w:ind w:left="2160" w:hanging="360"/>
+      </w:pPr>
+      <w:rPr>
+        <w:rFonts w:ascii="Wingdings" w:hAnsi="Wingdings" w:hint="default"/>
+        <w:sz w:val="20"/>
+      </w:rPr>
+    </w:lvl>
+    <w:lvl w:ilvl="3" w:tentative="1">
+      <w:start w:val="1"/>
+      <w:numFmt w:val="bullet"/>
+      <w:lvlText w:val=""/>
+      <w:lvlJc w:val="left"/>
+      <w:pPr>
+        <w:tabs>
+          <w:tab w:val="num" w:pos="2880"/>
+        </w:tabs>
+        <w:ind w:left="2880" w:hanging="360"/>
+      </w:pPr>
+      <w:rPr>
+        <w:rFonts w:ascii="Wingdings" w:hAnsi="Wingdings" w:hint="default"/>
+        <w:sz w:val="20"/>
+      </w:rPr>
+    </w:lvl>
+    <w:lvl w:ilvl="4" w:tentative="1">
+      <w:start w:val="1"/>
+      <w:numFmt w:val="bullet"/>
+      <w:lvlText w:val=""/>
+      <w:lvlJc w:val="left"/>
+      <w:pPr>
+        <w:tabs>
+          <w:tab w:val="num" w:pos="3600"/>
+        </w:tabs>
+        <w:ind w:left="3600" w:hanging="360"/>
+      </w:pPr>
+      <w:rPr>
+        <w:rFonts w:ascii="Wingdings" w:hAnsi="Wingdings" w:hint="default"/>
+        <w:sz w:val="20"/>
+      </w:rPr>
+    </w:lvl>
+    <w:lvl w:ilvl="5" w:tentative="1">
+      <w:start w:val="1"/>
+      <w:numFmt w:val="bullet"/>
+      <w:lvlText w:val=""/>
+      <w:lvlJc w:val="left"/>
+      <w:pPr>
+        <w:tabs>
+          <w:tab w:val="num" w:pos="4320"/>
+        </w:tabs>
+        <w:ind w:left="4320" w:hanging="360"/>
+      </w:pPr>
+      <w:rPr>
+        <w:rFonts w:ascii="Wingdings" w:hAnsi="Wingdings" w:hint="default"/>
+        <w:sz w:val="20"/>
+      </w:rPr>
+    </w:lvl>
+    <w:lvl w:ilvl="6" w:tentative="1">
+      <w:start w:val="1"/>
+      <w:numFmt w:val="bullet"/>
+      <w:lvlText w:val=""/>
+      <w:lvlJc w:val="left"/>
+      <w:pPr>
+        <w:tabs>
+          <w:tab w:val="num" w:pos="5040"/>
+        </w:tabs>
+        <w:ind w:left="5040" w:hanging="360"/>
+      </w:pPr>
+      <w:rPr>
+        <w:rFonts w:ascii="Wingdings" w:hAnsi="Wingdings" w:hint="default"/>
+        <w:sz w:val="20"/>
+      </w:rPr>
+    </w:lvl>
+    <w:lvl w:ilvl="7" w:tentative="1">
+      <w:start w:val="1"/>
+      <w:numFmt w:val="bullet"/>
+      <w:lvlText w:val=""/>
+      <w:lvlJc w:val="left"/>
+      <w:pPr>
+        <w:tabs>
+          <w:tab w:val="num" w:pos="5760"/>
+        </w:tabs>
+        <w:ind w:left="5760" w:hanging="360"/>
+      </w:pPr>
+      <w:rPr>
+        <w:rFonts w:ascii="Wingdings" w:hAnsi="Wingdings" w:hint="default"/>
+        <w:sz w:val="20"/>
+      </w:rPr>
+    </w:lvl>
+    <w:lvl w:ilvl="8" w:tentative="1">
+      <w:start w:val="1"/>
+      <w:numFmt w:val="bullet"/>
+      <w:lvlText w:val=""/>
+      <w:lvlJc w:val="left"/>
+      <w:pPr>
+        <w:tabs>
+          <w:tab w:val="num" w:pos="6480"/>
+        </w:tabs>
+        <w:ind w:left="6480" w:hanging="360"/>
+      </w:pPr>
+      <w:rPr>
+        <w:rFonts w:ascii="Wingdings" w:hAnsi="Wingdings" w:hint="default"/>
+        <w:sz w:val="20"/>
+      </w:rPr>
+    </w:lvl>
+  </w:abstractNum>
+  <w:abstractNum w:abstractNumId="8" w15:restartNumberingAfterBreak="0">
+    <w:nsid w:val="3E062BD1"/>
+    <w:multiLevelType w:val="multilevel"/>
+    <w:tmpl w:val="3EA25EAC"/>
+    <w:lvl w:ilvl="0">
+      <w:start w:val="1"/>
+      <w:numFmt w:val="bullet"/>
+      <w:lvlText w:val=""/>
+      <w:lvlJc w:val="left"/>
+      <w:pPr>
+        <w:tabs>
+          <w:tab w:val="num" w:pos="720"/>
+        </w:tabs>
+        <w:ind w:left="720" w:hanging="360"/>
+      </w:pPr>
+      <w:rPr>
+        <w:rFonts w:ascii="Symbol" w:hAnsi="Symbol" w:hint="default"/>
+        <w:sz w:val="20"/>
+      </w:rPr>
+    </w:lvl>
+    <w:lvl w:ilvl="1" w:tentative="1">
+      <w:start w:val="1"/>
+      <w:numFmt w:val="bullet"/>
+      <w:lvlText w:val="o"/>
+      <w:lvlJc w:val="left"/>
+      <w:pPr>
+        <w:tabs>
+          <w:tab w:val="num" w:pos="1440"/>
+        </w:tabs>
+        <w:ind w:left="1440" w:hanging="360"/>
+      </w:pPr>
+      <w:rPr>
+        <w:rFonts w:ascii="Courier New" w:hAnsi="Courier New" w:hint="default"/>
+        <w:sz w:val="20"/>
+      </w:rPr>
+    </w:lvl>
+    <w:lvl w:ilvl="2" w:tentative="1">
+      <w:start w:val="1"/>
+      <w:numFmt w:val="bullet"/>
+      <w:lvlText w:val=""/>
+      <w:lvlJc w:val="left"/>
+      <w:pPr>
+        <w:tabs>
+          <w:tab w:val="num" w:pos="2160"/>
+        </w:tabs>
+        <w:ind w:left="2160" w:hanging="360"/>
+      </w:pPr>
+      <w:rPr>
+        <w:rFonts w:ascii="Wingdings" w:hAnsi="Wingdings" w:hint="default"/>
+        <w:sz w:val="20"/>
+      </w:rPr>
+    </w:lvl>
+    <w:lvl w:ilvl="3" w:tentative="1">
+      <w:start w:val="1"/>
+      <w:numFmt w:val="bullet"/>
+      <w:lvlText w:val=""/>
+      <w:lvlJc w:val="left"/>
+      <w:pPr>
+        <w:tabs>
+          <w:tab w:val="num" w:pos="2880"/>
+        </w:tabs>
+        <w:ind w:left="2880" w:hanging="360"/>
+      </w:pPr>
+      <w:rPr>
+        <w:rFonts w:ascii="Wingdings" w:hAnsi="Wingdings" w:hint="default"/>
+        <w:sz w:val="20"/>
+      </w:rPr>
+    </w:lvl>
+    <w:lvl w:ilvl="4" w:tentative="1">
+      <w:start w:val="1"/>
+      <w:numFmt w:val="bullet"/>
+      <w:lvlText w:val=""/>
+      <w:lvlJc w:val="left"/>
+      <w:pPr>
+        <w:tabs>
+          <w:tab w:val="num" w:pos="3600"/>
+        </w:tabs>
+        <w:ind w:left="3600" w:hanging="360"/>
+      </w:pPr>
+      <w:rPr>
+        <w:rFonts w:ascii="Wingdings" w:hAnsi="Wingdings" w:hint="default"/>
+        <w:sz w:val="20"/>
+      </w:rPr>
+    </w:lvl>
+    <w:lvl w:ilvl="5" w:tentative="1">
+      <w:start w:val="1"/>
+      <w:numFmt w:val="bullet"/>
+      <w:lvlText w:val=""/>
+      <w:lvlJc w:val="left"/>
+      <w:pPr>
+        <w:tabs>
+          <w:tab w:val="num" w:pos="4320"/>
+        </w:tabs>
+        <w:ind w:left="4320" w:hanging="360"/>
+      </w:pPr>
+      <w:rPr>
+        <w:rFonts w:ascii="Wingdings" w:hAnsi="Wingdings" w:hint="default"/>
+        <w:sz w:val="20"/>
+      </w:rPr>
+    </w:lvl>
+    <w:lvl w:ilvl="6" w:tentative="1">
+      <w:start w:val="1"/>
+      <w:numFmt w:val="bullet"/>
+      <w:lvlText w:val=""/>
+      <w:lvlJc w:val="left"/>
+      <w:pPr>
+        <w:tabs>
+          <w:tab w:val="num" w:pos="5040"/>
+        </w:tabs>
+        <w:ind w:left="5040" w:hanging="360"/>
+      </w:pPr>
+      <w:rPr>
+        <w:rFonts w:ascii="Wingdings" w:hAnsi="Wingdings" w:hint="default"/>
+        <w:sz w:val="20"/>
+      </w:rPr>
+    </w:lvl>
+    <w:lvl w:ilvl="7" w:tentative="1">
+      <w:start w:val="1"/>
+      <w:numFmt w:val="bullet"/>
+      <w:lvlText w:val=""/>
+      <w:lvlJc w:val="left"/>
+      <w:pPr>
+        <w:tabs>
+          <w:tab w:val="num" w:pos="5760"/>
+        </w:tabs>
+        <w:ind w:left="5760" w:hanging="360"/>
+      </w:pPr>
+      <w:rPr>
+        <w:rFonts w:ascii="Wingdings" w:hAnsi="Wingdings" w:hint="default"/>
+        <w:sz w:val="20"/>
+      </w:rPr>
+    </w:lvl>
+    <w:lvl w:ilvl="8" w:tentative="1">
+      <w:start w:val="1"/>
+      <w:numFmt w:val="bullet"/>
+      <w:lvlText w:val=""/>
+      <w:lvlJc w:val="left"/>
+      <w:pPr>
+        <w:tabs>
+          <w:tab w:val="num" w:pos="6480"/>
+        </w:tabs>
+        <w:ind w:left="6480" w:hanging="360"/>
+      </w:pPr>
+      <w:rPr>
+        <w:rFonts w:ascii="Wingdings" w:hAnsi="Wingdings" w:hint="default"/>
+        <w:sz w:val="20"/>
+      </w:rPr>
+    </w:lvl>
+  </w:abstractNum>
+  <w:abstractNum w:abstractNumId="9" w15:restartNumberingAfterBreak="0">
+    <w:nsid w:val="3E5D43CB"/>
+    <w:multiLevelType w:val="multilevel"/>
+    <w:tmpl w:val="EDBCD1C6"/>
+    <w:lvl w:ilvl="0">
+      <w:start w:val="1"/>
+      <w:numFmt w:val="bullet"/>
+      <w:lvlText w:val=""/>
+      <w:lvlJc w:val="left"/>
+      <w:pPr>
+        <w:tabs>
+          <w:tab w:val="num" w:pos="720"/>
+        </w:tabs>
+        <w:ind w:left="720" w:hanging="360"/>
+      </w:pPr>
+      <w:rPr>
+        <w:rFonts w:ascii="Symbol" w:hAnsi="Symbol" w:hint="default"/>
+        <w:sz w:val="20"/>
+      </w:rPr>
+    </w:lvl>
+    <w:lvl w:ilvl="1" w:tentative="1">
+      <w:start w:val="1"/>
+      <w:numFmt w:val="bullet"/>
+      <w:lvlText w:val="o"/>
+      <w:lvlJc w:val="left"/>
+      <w:pPr>
+        <w:tabs>
+          <w:tab w:val="num" w:pos="1440"/>
+        </w:tabs>
+        <w:ind w:left="1440" w:hanging="360"/>
+      </w:pPr>
+      <w:rPr>
+        <w:rFonts w:ascii="Courier New" w:hAnsi="Courier New" w:hint="default"/>
+        <w:sz w:val="20"/>
+      </w:rPr>
+    </w:lvl>
+    <w:lvl w:ilvl="2" w:tentative="1">
+      <w:start w:val="1"/>
+      <w:numFmt w:val="bullet"/>
+      <w:lvlText w:val=""/>
+      <w:lvlJc w:val="left"/>
+      <w:pPr>
+        <w:tabs>
+          <w:tab w:val="num" w:pos="2160"/>
+        </w:tabs>
+        <w:ind w:left="2160" w:hanging="360"/>
+      </w:pPr>
+      <w:rPr>
+        <w:rFonts w:ascii="Wingdings" w:hAnsi="Wingdings" w:hint="default"/>
+        <w:sz w:val="20"/>
+      </w:rPr>
+    </w:lvl>
+    <w:lvl w:ilvl="3" w:tentative="1">
+      <w:start w:val="1"/>
+      <w:numFmt w:val="bullet"/>
+      <w:lvlText w:val=""/>
+      <w:lvlJc w:val="left"/>
+      <w:pPr>
+        <w:tabs>
+          <w:tab w:val="num" w:pos="2880"/>
+        </w:tabs>
+        <w:ind w:left="2880" w:hanging="360"/>
+      </w:pPr>
+      <w:rPr>
+        <w:rFonts w:ascii="Wingdings" w:hAnsi="Wingdings" w:hint="default"/>
+        <w:sz w:val="20"/>
+      </w:rPr>
+    </w:lvl>
+    <w:lvl w:ilvl="4" w:tentative="1">
+      <w:start w:val="1"/>
+      <w:numFmt w:val="bullet"/>
+      <w:lvlText w:val=""/>
+      <w:lvlJc w:val="left"/>
+      <w:pPr>
+        <w:tabs>
+          <w:tab w:val="num" w:pos="3600"/>
+        </w:tabs>
+        <w:ind w:left="3600" w:hanging="360"/>
+      </w:pPr>
+      <w:rPr>
+        <w:rFonts w:ascii="Wingdings" w:hAnsi="Wingdings" w:hint="default"/>
+        <w:sz w:val="20"/>
+      </w:rPr>
+    </w:lvl>
+    <w:lvl w:ilvl="5" w:tentative="1">
+      <w:start w:val="1"/>
+      <w:numFmt w:val="bullet"/>
+      <w:lvlText w:val=""/>
+      <w:lvlJc w:val="left"/>
+      <w:pPr>
+        <w:tabs>
+          <w:tab w:val="num" w:pos="4320"/>
+        </w:tabs>
+        <w:ind w:left="4320" w:hanging="360"/>
+      </w:pPr>
+      <w:rPr>
+        <w:rFonts w:ascii="Wingdings" w:hAnsi="Wingdings" w:hint="default"/>
+        <w:sz w:val="20"/>
+      </w:rPr>
+    </w:lvl>
+    <w:lvl w:ilvl="6" w:tentative="1">
+      <w:start w:val="1"/>
+      <w:numFmt w:val="bullet"/>
+      <w:lvlText w:val=""/>
+      <w:lvlJc w:val="left"/>
+      <w:pPr>
+        <w:tabs>
+          <w:tab w:val="num" w:pos="5040"/>
+        </w:tabs>
+        <w:ind w:left="5040" w:hanging="360"/>
+      </w:pPr>
+      <w:rPr>
+        <w:rFonts w:ascii="Wingdings" w:hAnsi="Wingdings" w:hint="default"/>
+        <w:sz w:val="20"/>
+      </w:rPr>
+    </w:lvl>
+    <w:lvl w:ilvl="7" w:tentative="1">
+      <w:start w:val="1"/>
+      <w:numFmt w:val="bullet"/>
+      <w:lvlText w:val=""/>
+      <w:lvlJc w:val="left"/>
+      <w:pPr>
+        <w:tabs>
+          <w:tab w:val="num" w:pos="5760"/>
+        </w:tabs>
+        <w:ind w:left="5760" w:hanging="360"/>
+      </w:pPr>
+      <w:rPr>
+        <w:rFonts w:ascii="Wingdings" w:hAnsi="Wingdings" w:hint="default"/>
+        <w:sz w:val="20"/>
+      </w:rPr>
+    </w:lvl>
+    <w:lvl w:ilvl="8" w:tentative="1">
+      <w:start w:val="1"/>
+      <w:numFmt w:val="bullet"/>
+      <w:lvlText w:val=""/>
+      <w:lvlJc w:val="left"/>
+      <w:pPr>
+        <w:tabs>
+          <w:tab w:val="num" w:pos="6480"/>
+        </w:tabs>
+        <w:ind w:left="6480" w:hanging="360"/>
+      </w:pPr>
+      <w:rPr>
+        <w:rFonts w:ascii="Wingdings" w:hAnsi="Wingdings" w:hint="default"/>
+        <w:sz w:val="20"/>
+      </w:rPr>
+    </w:lvl>
+  </w:abstractNum>
+  <w:abstractNum w:abstractNumId="10" w15:restartNumberingAfterBreak="0">
     <w:nsid w:val="41C85CAE"/>
     <w:multiLevelType w:val="multilevel"/>
     <w:tmpl w:val="7D10611A"/>
@@ -6215,7 +9133,7 @@
       </w:rPr>
     </w:lvl>
   </w:abstractNum>
-  <w:abstractNum w:abstractNumId="6" w15:restartNumberingAfterBreak="0">
+  <w:abstractNum w:abstractNumId="11" w15:restartNumberingAfterBreak="0">
     <w:nsid w:val="42D946BC"/>
     <w:multiLevelType w:val="multilevel"/>
     <w:tmpl w:val="A8869382"/>
@@ -6364,7 +9282,7 @@
       </w:rPr>
     </w:lvl>
   </w:abstractNum>
-  <w:abstractNum w:abstractNumId="7" w15:restartNumberingAfterBreak="0">
+  <w:abstractNum w:abstractNumId="12" w15:restartNumberingAfterBreak="0">
     <w:nsid w:val="4A211E8E"/>
     <w:multiLevelType w:val="multilevel"/>
     <w:tmpl w:val="B5947E2A"/>
@@ -6513,7 +9431,7 @@
       </w:rPr>
     </w:lvl>
   </w:abstractNum>
-  <w:abstractNum w:abstractNumId="8" w15:restartNumberingAfterBreak="0">
+  <w:abstractNum w:abstractNumId="13" w15:restartNumberingAfterBreak="0">
     <w:nsid w:val="4EC51787"/>
     <w:multiLevelType w:val="multilevel"/>
     <w:tmpl w:val="ADE6D538"/>
@@ -6662,7 +9580,156 @@
       </w:rPr>
     </w:lvl>
   </w:abstractNum>
-  <w:abstractNum w:abstractNumId="9" w15:restartNumberingAfterBreak="0">
+  <w:abstractNum w:abstractNumId="14" w15:restartNumberingAfterBreak="0">
+    <w:nsid w:val="50CE442D"/>
+    <w:multiLevelType w:val="multilevel"/>
+    <w:tmpl w:val="6ECE6E5A"/>
+    <w:lvl w:ilvl="0">
+      <w:start w:val="1"/>
+      <w:numFmt w:val="bullet"/>
+      <w:lvlText w:val=""/>
+      <w:lvlJc w:val="left"/>
+      <w:pPr>
+        <w:tabs>
+          <w:tab w:val="num" w:pos="720"/>
+        </w:tabs>
+        <w:ind w:left="720" w:hanging="360"/>
+      </w:pPr>
+      <w:rPr>
+        <w:rFonts w:ascii="Symbol" w:hAnsi="Symbol" w:hint="default"/>
+        <w:sz w:val="20"/>
+      </w:rPr>
+    </w:lvl>
+    <w:lvl w:ilvl="1" w:tentative="1">
+      <w:start w:val="1"/>
+      <w:numFmt w:val="bullet"/>
+      <w:lvlText w:val="o"/>
+      <w:lvlJc w:val="left"/>
+      <w:pPr>
+        <w:tabs>
+          <w:tab w:val="num" w:pos="1440"/>
+        </w:tabs>
+        <w:ind w:left="1440" w:hanging="360"/>
+      </w:pPr>
+      <w:rPr>
+        <w:rFonts w:ascii="Courier New" w:hAnsi="Courier New" w:hint="default"/>
+        <w:sz w:val="20"/>
+      </w:rPr>
+    </w:lvl>
+    <w:lvl w:ilvl="2" w:tentative="1">
+      <w:start w:val="1"/>
+      <w:numFmt w:val="bullet"/>
+      <w:lvlText w:val=""/>
+      <w:lvlJc w:val="left"/>
+      <w:pPr>
+        <w:tabs>
+          <w:tab w:val="num" w:pos="2160"/>
+        </w:tabs>
+        <w:ind w:left="2160" w:hanging="360"/>
+      </w:pPr>
+      <w:rPr>
+        <w:rFonts w:ascii="Wingdings" w:hAnsi="Wingdings" w:hint="default"/>
+        <w:sz w:val="20"/>
+      </w:rPr>
+    </w:lvl>
+    <w:lvl w:ilvl="3" w:tentative="1">
+      <w:start w:val="1"/>
+      <w:numFmt w:val="bullet"/>
+      <w:lvlText w:val=""/>
+      <w:lvlJc w:val="left"/>
+      <w:pPr>
+        <w:tabs>
+          <w:tab w:val="num" w:pos="2880"/>
+        </w:tabs>
+        <w:ind w:left="2880" w:hanging="360"/>
+      </w:pPr>
+      <w:rPr>
+        <w:rFonts w:ascii="Wingdings" w:hAnsi="Wingdings" w:hint="default"/>
+        <w:sz w:val="20"/>
+      </w:rPr>
+    </w:lvl>
+    <w:lvl w:ilvl="4" w:tentative="1">
+      <w:start w:val="1"/>
+      <w:numFmt w:val="bullet"/>
+      <w:lvlText w:val=""/>
+      <w:lvlJc w:val="left"/>
+      <w:pPr>
+        <w:tabs>
+          <w:tab w:val="num" w:pos="3600"/>
+        </w:tabs>
+        <w:ind w:left="3600" w:hanging="360"/>
+      </w:pPr>
+      <w:rPr>
+        <w:rFonts w:ascii="Wingdings" w:hAnsi="Wingdings" w:hint="default"/>
+        <w:sz w:val="20"/>
+      </w:rPr>
+    </w:lvl>
+    <w:lvl w:ilvl="5" w:tentative="1">
+      <w:start w:val="1"/>
+      <w:numFmt w:val="bullet"/>
+      <w:lvlText w:val=""/>
+      <w:lvlJc w:val="left"/>
+      <w:pPr>
+        <w:tabs>
+          <w:tab w:val="num" w:pos="4320"/>
+        </w:tabs>
+        <w:ind w:left="4320" w:hanging="360"/>
+      </w:pPr>
+      <w:rPr>
+        <w:rFonts w:ascii="Wingdings" w:hAnsi="Wingdings" w:hint="default"/>
+        <w:sz w:val="20"/>
+      </w:rPr>
+    </w:lvl>
+    <w:lvl w:ilvl="6" w:tentative="1">
+      <w:start w:val="1"/>
+      <w:numFmt w:val="bullet"/>
+      <w:lvlText w:val=""/>
+      <w:lvlJc w:val="left"/>
+      <w:pPr>
+        <w:tabs>
+          <w:tab w:val="num" w:pos="5040"/>
+        </w:tabs>
+        <w:ind w:left="5040" w:hanging="360"/>
+      </w:pPr>
+      <w:rPr>
+        <w:rFonts w:ascii="Wingdings" w:hAnsi="Wingdings" w:hint="default"/>
+        <w:sz w:val="20"/>
+      </w:rPr>
+    </w:lvl>
+    <w:lvl w:ilvl="7" w:tentative="1">
+      <w:start w:val="1"/>
+      <w:numFmt w:val="bullet"/>
+      <w:lvlText w:val=""/>
+      <w:lvlJc w:val="left"/>
+      <w:pPr>
+        <w:tabs>
+          <w:tab w:val="num" w:pos="5760"/>
+        </w:tabs>
+        <w:ind w:left="5760" w:hanging="360"/>
+      </w:pPr>
+      <w:rPr>
+        <w:rFonts w:ascii="Wingdings" w:hAnsi="Wingdings" w:hint="default"/>
+        <w:sz w:val="20"/>
+      </w:rPr>
+    </w:lvl>
+    <w:lvl w:ilvl="8" w:tentative="1">
+      <w:start w:val="1"/>
+      <w:numFmt w:val="bullet"/>
+      <w:lvlText w:val=""/>
+      <w:lvlJc w:val="left"/>
+      <w:pPr>
+        <w:tabs>
+          <w:tab w:val="num" w:pos="6480"/>
+        </w:tabs>
+        <w:ind w:left="6480" w:hanging="360"/>
+      </w:pPr>
+      <w:rPr>
+        <w:rFonts w:ascii="Wingdings" w:hAnsi="Wingdings" w:hint="default"/>
+        <w:sz w:val="20"/>
+      </w:rPr>
+    </w:lvl>
+  </w:abstractNum>
+  <w:abstractNum w:abstractNumId="15" w15:restartNumberingAfterBreak="0">
     <w:nsid w:val="548B2C35"/>
     <w:multiLevelType w:val="multilevel"/>
     <w:tmpl w:val="378AF63E"/>
@@ -6811,7 +9878,7 @@
       </w:rPr>
     </w:lvl>
   </w:abstractNum>
-  <w:abstractNum w:abstractNumId="10" w15:restartNumberingAfterBreak="0">
+  <w:abstractNum w:abstractNumId="16" w15:restartNumberingAfterBreak="0">
     <w:nsid w:val="5BD83053"/>
     <w:multiLevelType w:val="multilevel"/>
     <w:tmpl w:val="22D25C80"/>
@@ -6960,7 +10027,7 @@
       </w:rPr>
     </w:lvl>
   </w:abstractNum>
-  <w:abstractNum w:abstractNumId="11" w15:restartNumberingAfterBreak="0">
+  <w:abstractNum w:abstractNumId="17" w15:restartNumberingAfterBreak="0">
     <w:nsid w:val="6F345F4C"/>
     <w:multiLevelType w:val="multilevel"/>
     <w:tmpl w:val="7302ADC2"/>
@@ -7109,7 +10176,7 @@
       </w:rPr>
     </w:lvl>
   </w:abstractNum>
-  <w:abstractNum w:abstractNumId="12" w15:restartNumberingAfterBreak="0">
+  <w:abstractNum w:abstractNumId="18" w15:restartNumberingAfterBreak="0">
     <w:nsid w:val="76445427"/>
     <w:multiLevelType w:val="multilevel"/>
     <w:tmpl w:val="3A0EA122"/>
@@ -7258,7 +10325,7 @@
       </w:rPr>
     </w:lvl>
   </w:abstractNum>
-  <w:abstractNum w:abstractNumId="13" w15:restartNumberingAfterBreak="0">
+  <w:abstractNum w:abstractNumId="19" w15:restartNumberingAfterBreak="0">
     <w:nsid w:val="7BBE703E"/>
     <w:multiLevelType w:val="multilevel"/>
     <w:tmpl w:val="911E92BE"/>
@@ -7408,46 +10475,64 @@
     </w:lvl>
   </w:abstractNum>
   <w:num w:numId="1" w16cid:durableId="1501966933">
-    <w:abstractNumId w:val="7"/>
+    <w:abstractNumId w:val="12"/>
   </w:num>
   <w:num w:numId="2" w16cid:durableId="581531492">
+    <w:abstractNumId w:val="6"/>
+  </w:num>
+  <w:num w:numId="3" w16cid:durableId="258609353">
+    <w:abstractNumId w:val="19"/>
+  </w:num>
+  <w:num w:numId="4" w16cid:durableId="557978133">
     <w:abstractNumId w:val="4"/>
   </w:num>
-  <w:num w:numId="3" w16cid:durableId="258609353">
+  <w:num w:numId="5" w16cid:durableId="787357444">
+    <w:abstractNumId w:val="17"/>
+  </w:num>
+  <w:num w:numId="6" w16cid:durableId="205339483">
+    <w:abstractNumId w:val="3"/>
+  </w:num>
+  <w:num w:numId="7" w16cid:durableId="689838433">
+    <w:abstractNumId w:val="11"/>
+  </w:num>
+  <w:num w:numId="8" w16cid:durableId="1416828592">
+    <w:abstractNumId w:val="10"/>
+  </w:num>
+  <w:num w:numId="9" w16cid:durableId="205610270">
+    <w:abstractNumId w:val="16"/>
+  </w:num>
+  <w:num w:numId="10" w16cid:durableId="1405179909">
+    <w:abstractNumId w:val="1"/>
+  </w:num>
+  <w:num w:numId="11" w16cid:durableId="373699705">
+    <w:abstractNumId w:val="18"/>
+  </w:num>
+  <w:num w:numId="12" w16cid:durableId="820846987">
+    <w:abstractNumId w:val="15"/>
+  </w:num>
+  <w:num w:numId="13" w16cid:durableId="201945523">
+    <w:abstractNumId w:val="2"/>
+  </w:num>
+  <w:num w:numId="14" w16cid:durableId="589196202">
     <w:abstractNumId w:val="13"/>
   </w:num>
-  <w:num w:numId="4" w16cid:durableId="557978133">
-    <w:abstractNumId w:val="3"/>
+  <w:num w:numId="15" w16cid:durableId="1289045628">
+    <w:abstractNumId w:val="0"/>
   </w:num>
-  <w:num w:numId="5" w16cid:durableId="787357444">
-    <w:abstractNumId w:val="11"/>
+  <w:num w:numId="16" w16cid:durableId="1897817713">
+    <w:abstractNumId w:val="14"/>
   </w:num>
-  <w:num w:numId="6" w16cid:durableId="205339483">
-    <w:abstractNumId w:val="2"/>
+  <w:num w:numId="17" w16cid:durableId="545485913">
+    <w:abstractNumId w:val="8"/>
   </w:num>
-  <w:num w:numId="7" w16cid:durableId="689838433">
-    <w:abstractNumId w:val="6"/>
+  <w:num w:numId="18" w16cid:durableId="301472843">
+    <w:abstractNumId w:val="9"/>
   </w:num>
-  <w:num w:numId="8" w16cid:durableId="1416828592">
+  <w:num w:numId="19" w16cid:durableId="566037332">
     <w:abstractNumId w:val="5"/>
   </w:num>
-  <w:num w:numId="9" w16cid:durableId="205610270">
-    <w:abstractNumId w:val="10"/>
-  </w:num>
-  <w:num w:numId="10" w16cid:durableId="1405179909">
-    <w:abstractNumId w:val="0"/>
-  </w:num>
-  <w:num w:numId="11" w16cid:durableId="373699705">
-    <w:abstractNumId w:val="12"/>
-  </w:num>
-  <w:num w:numId="12" w16cid:durableId="820846987">
-    <w:abstractNumId w:val="9"/>
-  </w:num>
-  <w:num w:numId="13" w16cid:durableId="201945523">
-    <w:abstractNumId w:val="1"/>
-  </w:num>
-  <w:num w:numId="14" w16cid:durableId="589196202">
-    <w:abstractNumId w:val="8"/>
+  <w:num w:numId="20" w16cid:durableId="315233554">
+    <w:abstractNumId w:val="7"/>
   </w:num>
 </w:numbering>
 </file>

</xml_diff>